<commit_message>
Knowledge - 3-Work knowledge - fix location - part 25 - 11/8/2025
</commit_message>
<xml_diff>
--- a/Knowledge/3-Work knowledge/1-Software Engineering/1-Testing/5-My Source/1-ISTQB Foundation Level/5-Test Management/1-Phases of the Software Testing Life Cycle (STLC)/3-Test Planning.docx
+++ b/Knowledge/3-Work knowledge/1-Software Engineering/1-Testing/5-My Source/1-ISTQB Foundation Level/5-Test Management/1-Phases of the Software Testing Life Cycle (STLC)/3-Test Planning.docx
@@ -42,21 +42,12 @@
         </w:rPr>
         <w:t xml:space="preserve">: </w:t>
       </w:r>
-      <w:proofErr w:type="spellStart"/>
-      <w:r>
-        <w:rPr>
-          <w:b/>
-          <w:shd w:val="clear" w:color="auto" w:fill="B7B7B7"/>
-        </w:rPr>
-        <w:t>Chatgpt</w:t>
-      </w:r>
-      <w:proofErr w:type="spellEnd"/>
-      <w:r>
-        <w:rPr>
-          <w:b/>
-          <w:shd w:val="clear" w:color="auto" w:fill="B7B7B7"/>
-        </w:rPr>
-        <w:t xml:space="preserve"> </w:t>
+      <w:r>
+        <w:rPr>
+          <w:b/>
+          <w:shd w:val="clear" w:color="auto" w:fill="B7B7B7"/>
+        </w:rPr>
+        <w:t xml:space="preserve">Chatgpt </w:t>
       </w:r>
       <w:r>
         <w:rPr>
@@ -65,7 +56,26 @@
           <w:szCs w:val="14"/>
           <w:shd w:val="clear" w:color="auto" w:fill="B7B7B7"/>
         </w:rPr>
-        <w:t>(GPT-5-Standard) at [8/17/2025]</w:t>
+        <w:t>(GPT</w:t>
+      </w:r>
+      <w:r>
+        <w:rPr>
+          <w:rFonts w:ascii="Cambria Math" w:hAnsi="Cambria Math" w:cs="Cambria Math"/>
+          <w:b/>
+          <w:sz w:val="14"/>
+          <w:szCs w:val="14"/>
+          <w:shd w:val="clear" w:color="auto" w:fill="B7B7B7"/>
+        </w:rPr>
+        <w:t>‑</w:t>
+      </w:r>
+      <w:r>
+        <w:rPr>
+          <w:b/>
+          <w:sz w:val="14"/>
+          <w:szCs w:val="14"/>
+          <w:shd w:val="clear" w:color="auto" w:fill="B7B7B7"/>
+        </w:rPr>
+        <w:t>5 Mini) at [8/17/2025]</w:t>
       </w:r>
     </w:p>
     <w:p>
@@ -144,7 +154,7 @@
     </w:p>
     <w:p>
       <w:r>
-        <w:pict w14:anchorId="33D16DD1">
+        <w:pict w14:anchorId="10B5F203">
           <v:rect id="_x0000_i1025" style="width:0;height:1.5pt" o:hralign="center" o:hrstd="t" o:hr="t" fillcolor="#a0a0a0" stroked="f"/>
         </w:pict>
       </w:r>
@@ -195,21 +205,12 @@
         </w:rPr>
         <w:t xml:space="preserve">: </w:t>
       </w:r>
-      <w:proofErr w:type="spellStart"/>
-      <w:r>
-        <w:rPr>
-          <w:b/>
-          <w:shd w:val="clear" w:color="auto" w:fill="B7B7B7"/>
-        </w:rPr>
-        <w:t>Chatgpt</w:t>
-      </w:r>
-      <w:proofErr w:type="spellEnd"/>
-      <w:r>
-        <w:rPr>
-          <w:b/>
-          <w:shd w:val="clear" w:color="auto" w:fill="B7B7B7"/>
-        </w:rPr>
-        <w:t xml:space="preserve"> </w:t>
+      <w:r>
+        <w:rPr>
+          <w:b/>
+          <w:shd w:val="clear" w:color="auto" w:fill="B7B7B7"/>
+        </w:rPr>
+        <w:t xml:space="preserve">Chatgpt </w:t>
       </w:r>
       <w:r>
         <w:rPr>
@@ -218,7 +219,26 @@
           <w:szCs w:val="14"/>
           <w:shd w:val="clear" w:color="auto" w:fill="B7B7B7"/>
         </w:rPr>
-        <w:t>(GPT-5-Standard) at [8/17/2025]</w:t>
+        <w:t>(GPT</w:t>
+      </w:r>
+      <w:r>
+        <w:rPr>
+          <w:rFonts w:ascii="Cambria Math" w:hAnsi="Cambria Math" w:cs="Cambria Math"/>
+          <w:b/>
+          <w:sz w:val="14"/>
+          <w:szCs w:val="14"/>
+          <w:shd w:val="clear" w:color="auto" w:fill="B7B7B7"/>
+        </w:rPr>
+        <w:t>‑</w:t>
+      </w:r>
+      <w:r>
+        <w:rPr>
+          <w:b/>
+          <w:sz w:val="14"/>
+          <w:szCs w:val="14"/>
+          <w:shd w:val="clear" w:color="auto" w:fill="B7B7B7"/>
+        </w:rPr>
+        <w:t>5 Mini) at [8/17/2025]</w:t>
       </w:r>
     </w:p>
     <w:p>
@@ -270,7 +290,7 @@
     </w:p>
     <w:p>
       <w:r>
-        <w:pict w14:anchorId="36DF5199">
+        <w:pict w14:anchorId="2F121B48">
           <v:rect id="_x0000_i1026" style="width:0;height:1.5pt" o:hralign="center" o:hrstd="t" o:hr="t" fillcolor="#a0a0a0" stroked="f"/>
         </w:pict>
       </w:r>
@@ -280,7 +300,6 @@
         <w:pStyle w:val="Heading2"/>
         <w:keepNext w:val="0"/>
         <w:keepLines w:val="0"/>
-        <w:spacing w:after="80"/>
         <w:rPr>
           <w:b/>
           <w:sz w:val="34"/>
@@ -315,21 +334,12 @@
         </w:rPr>
         <w:t xml:space="preserve">: </w:t>
       </w:r>
-      <w:proofErr w:type="spellStart"/>
-      <w:r>
-        <w:rPr>
-          <w:b/>
-          <w:shd w:val="clear" w:color="auto" w:fill="B7B7B7"/>
-        </w:rPr>
-        <w:t>Chatgpt</w:t>
-      </w:r>
-      <w:proofErr w:type="spellEnd"/>
-      <w:r>
-        <w:rPr>
-          <w:b/>
-          <w:shd w:val="clear" w:color="auto" w:fill="B7B7B7"/>
-        </w:rPr>
-        <w:t xml:space="preserve"> </w:t>
+      <w:r>
+        <w:rPr>
+          <w:b/>
+          <w:shd w:val="clear" w:color="auto" w:fill="B7B7B7"/>
+        </w:rPr>
+        <w:t xml:space="preserve">Chatgpt </w:t>
       </w:r>
       <w:r>
         <w:rPr>
@@ -338,7 +348,26 @@
           <w:szCs w:val="14"/>
           <w:shd w:val="clear" w:color="auto" w:fill="B7B7B7"/>
         </w:rPr>
-        <w:t>(GPT-5-Standard) at [8/17/2025]</w:t>
+        <w:t>(GPT</w:t>
+      </w:r>
+      <w:r>
+        <w:rPr>
+          <w:rFonts w:ascii="Cambria Math" w:hAnsi="Cambria Math" w:cs="Cambria Math"/>
+          <w:b/>
+          <w:sz w:val="14"/>
+          <w:szCs w:val="14"/>
+          <w:shd w:val="clear" w:color="auto" w:fill="B7B7B7"/>
+        </w:rPr>
+        <w:t>‑</w:t>
+      </w:r>
+      <w:r>
+        <w:rPr>
+          <w:b/>
+          <w:sz w:val="14"/>
+          <w:szCs w:val="14"/>
+          <w:shd w:val="clear" w:color="auto" w:fill="B7B7B7"/>
+        </w:rPr>
+        <w:t>5 Mini) at [8/17/2025]</w:t>
       </w:r>
     </w:p>
     <w:p>
@@ -673,7 +702,7 @@
         <w:spacing w:before="240" w:after="240"/>
       </w:pPr>
       <w:r>
-        <w:pict w14:anchorId="48C72D14">
+        <w:pict w14:anchorId="64AD69DA">
           <v:rect id="_x0000_i1027" style="width:0;height:1.5pt" o:hralign="center" o:hrstd="t" o:hr="t" fillcolor="#a0a0a0" stroked="f"/>
         </w:pict>
       </w:r>
@@ -720,21 +749,12 @@
         </w:rPr>
         <w:t xml:space="preserve">: </w:t>
       </w:r>
-      <w:proofErr w:type="spellStart"/>
-      <w:r>
-        <w:rPr>
-          <w:b/>
-          <w:shd w:val="clear" w:color="auto" w:fill="B7B7B7"/>
-        </w:rPr>
-        <w:t>Chatgpt</w:t>
-      </w:r>
-      <w:proofErr w:type="spellEnd"/>
-      <w:r>
-        <w:rPr>
-          <w:b/>
-          <w:shd w:val="clear" w:color="auto" w:fill="B7B7B7"/>
-        </w:rPr>
-        <w:t xml:space="preserve"> </w:t>
+      <w:r>
+        <w:rPr>
+          <w:b/>
+          <w:shd w:val="clear" w:color="auto" w:fill="B7B7B7"/>
+        </w:rPr>
+        <w:t xml:space="preserve">Chatgpt </w:t>
       </w:r>
       <w:r>
         <w:rPr>
@@ -743,7 +763,26 @@
           <w:szCs w:val="14"/>
           <w:shd w:val="clear" w:color="auto" w:fill="B7B7B7"/>
         </w:rPr>
-        <w:t>(GPT-5-Standard) at [8/17/2025]</w:t>
+        <w:t>(GPT</w:t>
+      </w:r>
+      <w:r>
+        <w:rPr>
+          <w:rFonts w:ascii="Cambria Math" w:hAnsi="Cambria Math" w:cs="Cambria Math"/>
+          <w:b/>
+          <w:sz w:val="14"/>
+          <w:szCs w:val="14"/>
+          <w:shd w:val="clear" w:color="auto" w:fill="B7B7B7"/>
+        </w:rPr>
+        <w:t>‑</w:t>
+      </w:r>
+      <w:r>
+        <w:rPr>
+          <w:b/>
+          <w:sz w:val="14"/>
+          <w:szCs w:val="14"/>
+          <w:shd w:val="clear" w:color="auto" w:fill="B7B7B7"/>
+        </w:rPr>
+        <w:t>5 Mini) at [8/17/2025]</w:t>
       </w:r>
     </w:p>
     <w:p>
@@ -865,7 +904,7 @@
         <w:spacing w:before="240" w:after="240"/>
       </w:pPr>
       <w:r>
-        <w:pict w14:anchorId="23C03DDD">
+        <w:pict w14:anchorId="6BC2C215">
           <v:rect id="_x0000_i1028" style="width:0;height:1.5pt" o:hralign="center" o:hrstd="t" o:hr="t" fillcolor="#a0a0a0" stroked="f"/>
         </w:pict>
       </w:r>
@@ -899,21 +938,12 @@
         </w:rPr>
         <w:t xml:space="preserve">: </w:t>
       </w:r>
-      <w:proofErr w:type="spellStart"/>
-      <w:r>
-        <w:rPr>
-          <w:b/>
-          <w:shd w:val="clear" w:color="auto" w:fill="B7B7B7"/>
-        </w:rPr>
-        <w:t>Chatgpt</w:t>
-      </w:r>
-      <w:proofErr w:type="spellEnd"/>
-      <w:r>
-        <w:rPr>
-          <w:b/>
-          <w:shd w:val="clear" w:color="auto" w:fill="B7B7B7"/>
-        </w:rPr>
-        <w:t xml:space="preserve"> </w:t>
+      <w:r>
+        <w:rPr>
+          <w:b/>
+          <w:shd w:val="clear" w:color="auto" w:fill="B7B7B7"/>
+        </w:rPr>
+        <w:t xml:space="preserve">Chatgpt </w:t>
       </w:r>
       <w:r>
         <w:rPr>
@@ -922,7 +952,26 @@
           <w:szCs w:val="14"/>
           <w:shd w:val="clear" w:color="auto" w:fill="B7B7B7"/>
         </w:rPr>
-        <w:t>(GPT-5-Standard) at [8/17/2025]</w:t>
+        <w:t>(GPT</w:t>
+      </w:r>
+      <w:r>
+        <w:rPr>
+          <w:rFonts w:ascii="Cambria Math" w:hAnsi="Cambria Math" w:cs="Cambria Math"/>
+          <w:b/>
+          <w:sz w:val="14"/>
+          <w:szCs w:val="14"/>
+          <w:shd w:val="clear" w:color="auto" w:fill="B7B7B7"/>
+        </w:rPr>
+        <w:t>‑</w:t>
+      </w:r>
+      <w:r>
+        <w:rPr>
+          <w:b/>
+          <w:sz w:val="14"/>
+          <w:szCs w:val="14"/>
+          <w:shd w:val="clear" w:color="auto" w:fill="B7B7B7"/>
+        </w:rPr>
+        <w:t>5 Mini) at [8/17/2025]</w:t>
       </w:r>
     </w:p>
     <w:p>
@@ -1041,7 +1090,7 @@
         <w:spacing w:before="240" w:after="240"/>
       </w:pPr>
       <w:r>
-        <w:pict w14:anchorId="6E347AB8">
+        <w:pict w14:anchorId="299CA36E">
           <v:rect id="_x0000_i1029" style="width:0;height:1.5pt" o:hralign="center" o:hrstd="t" o:hr="t" fillcolor="#a0a0a0" stroked="f"/>
         </w:pict>
       </w:r>
@@ -1075,21 +1124,12 @@
         </w:rPr>
         <w:t xml:space="preserve">: </w:t>
       </w:r>
-      <w:proofErr w:type="spellStart"/>
-      <w:r>
-        <w:rPr>
-          <w:b/>
-          <w:shd w:val="clear" w:color="auto" w:fill="B7B7B7"/>
-        </w:rPr>
-        <w:t>Chatgpt</w:t>
-      </w:r>
-      <w:proofErr w:type="spellEnd"/>
-      <w:r>
-        <w:rPr>
-          <w:b/>
-          <w:shd w:val="clear" w:color="auto" w:fill="B7B7B7"/>
-        </w:rPr>
-        <w:t xml:space="preserve"> </w:t>
+      <w:r>
+        <w:rPr>
+          <w:b/>
+          <w:shd w:val="clear" w:color="auto" w:fill="B7B7B7"/>
+        </w:rPr>
+        <w:t xml:space="preserve">Chatgpt </w:t>
       </w:r>
       <w:r>
         <w:rPr>
@@ -1098,7 +1138,26 @@
           <w:szCs w:val="14"/>
           <w:shd w:val="clear" w:color="auto" w:fill="B7B7B7"/>
         </w:rPr>
-        <w:t>(GPT-5-Standard) at [8/17/2025]</w:t>
+        <w:t>(GPT</w:t>
+      </w:r>
+      <w:r>
+        <w:rPr>
+          <w:rFonts w:ascii="Cambria Math" w:hAnsi="Cambria Math" w:cs="Cambria Math"/>
+          <w:b/>
+          <w:sz w:val="14"/>
+          <w:szCs w:val="14"/>
+          <w:shd w:val="clear" w:color="auto" w:fill="B7B7B7"/>
+        </w:rPr>
+        <w:t>‑</w:t>
+      </w:r>
+      <w:r>
+        <w:rPr>
+          <w:b/>
+          <w:sz w:val="14"/>
+          <w:szCs w:val="14"/>
+          <w:shd w:val="clear" w:color="auto" w:fill="B7B7B7"/>
+        </w:rPr>
+        <w:t>5 Mini) at [8/17/2025]</w:t>
       </w:r>
     </w:p>
     <w:p>
@@ -1249,7 +1308,7 @@
         <w:spacing w:before="240" w:after="240"/>
       </w:pPr>
       <w:r>
-        <w:pict w14:anchorId="696D4817">
+        <w:pict w14:anchorId="793679EA">
           <v:rect id="_x0000_i1030" style="width:0;height:1.5pt" o:hralign="center" o:hrstd="t" o:hr="t" fillcolor="#a0a0a0" stroked="f"/>
         </w:pict>
       </w:r>
@@ -1283,21 +1342,12 @@
         </w:rPr>
         <w:t xml:space="preserve">: </w:t>
       </w:r>
-      <w:proofErr w:type="spellStart"/>
-      <w:r>
-        <w:rPr>
-          <w:b/>
-          <w:shd w:val="clear" w:color="auto" w:fill="B7B7B7"/>
-        </w:rPr>
-        <w:t>Chatgpt</w:t>
-      </w:r>
-      <w:proofErr w:type="spellEnd"/>
-      <w:r>
-        <w:rPr>
-          <w:b/>
-          <w:shd w:val="clear" w:color="auto" w:fill="B7B7B7"/>
-        </w:rPr>
-        <w:t xml:space="preserve"> </w:t>
+      <w:r>
+        <w:rPr>
+          <w:b/>
+          <w:shd w:val="clear" w:color="auto" w:fill="B7B7B7"/>
+        </w:rPr>
+        <w:t xml:space="preserve">Chatgpt </w:t>
       </w:r>
       <w:r>
         <w:rPr>
@@ -1306,7 +1356,26 @@
           <w:szCs w:val="14"/>
           <w:shd w:val="clear" w:color="auto" w:fill="B7B7B7"/>
         </w:rPr>
-        <w:t>(GPT-5-Standard) at [8/17/2025]</w:t>
+        <w:t>(GPT</w:t>
+      </w:r>
+      <w:r>
+        <w:rPr>
+          <w:rFonts w:ascii="Cambria Math" w:hAnsi="Cambria Math" w:cs="Cambria Math"/>
+          <w:b/>
+          <w:sz w:val="14"/>
+          <w:szCs w:val="14"/>
+          <w:shd w:val="clear" w:color="auto" w:fill="B7B7B7"/>
+        </w:rPr>
+        <w:t>‑</w:t>
+      </w:r>
+      <w:r>
+        <w:rPr>
+          <w:b/>
+          <w:sz w:val="14"/>
+          <w:szCs w:val="14"/>
+          <w:shd w:val="clear" w:color="auto" w:fill="B7B7B7"/>
+        </w:rPr>
+        <w:t>5 Mini) at [8/17/2025]</w:t>
       </w:r>
     </w:p>
     <w:p>
@@ -1474,7 +1543,7 @@
         <w:spacing w:before="240" w:after="240"/>
       </w:pPr>
       <w:r>
-        <w:pict w14:anchorId="16E883E3">
+        <w:pict w14:anchorId="39F006BC">
           <v:rect id="_x0000_i1031" style="width:0;height:1.5pt" o:hralign="center" o:hrstd="t" o:hr="t" fillcolor="#a0a0a0" stroked="f"/>
         </w:pict>
       </w:r>
@@ -1508,21 +1577,12 @@
         </w:rPr>
         <w:t xml:space="preserve">: </w:t>
       </w:r>
-      <w:proofErr w:type="spellStart"/>
-      <w:r>
-        <w:rPr>
-          <w:b/>
-          <w:shd w:val="clear" w:color="auto" w:fill="B7B7B7"/>
-        </w:rPr>
-        <w:t>Chatgpt</w:t>
-      </w:r>
-      <w:proofErr w:type="spellEnd"/>
-      <w:r>
-        <w:rPr>
-          <w:b/>
-          <w:shd w:val="clear" w:color="auto" w:fill="B7B7B7"/>
-        </w:rPr>
-        <w:t xml:space="preserve"> </w:t>
+      <w:r>
+        <w:rPr>
+          <w:b/>
+          <w:shd w:val="clear" w:color="auto" w:fill="B7B7B7"/>
+        </w:rPr>
+        <w:t xml:space="preserve">Chatgpt </w:t>
       </w:r>
       <w:r>
         <w:rPr>
@@ -1531,7 +1591,26 @@
           <w:szCs w:val="14"/>
           <w:shd w:val="clear" w:color="auto" w:fill="B7B7B7"/>
         </w:rPr>
-        <w:t>(GPT-5-Standard) at [8/17/2025]</w:t>
+        <w:t>(GPT</w:t>
+      </w:r>
+      <w:r>
+        <w:rPr>
+          <w:rFonts w:ascii="Cambria Math" w:hAnsi="Cambria Math" w:cs="Cambria Math"/>
+          <w:b/>
+          <w:sz w:val="14"/>
+          <w:szCs w:val="14"/>
+          <w:shd w:val="clear" w:color="auto" w:fill="B7B7B7"/>
+        </w:rPr>
+        <w:t>‑</w:t>
+      </w:r>
+      <w:r>
+        <w:rPr>
+          <w:b/>
+          <w:sz w:val="14"/>
+          <w:szCs w:val="14"/>
+          <w:shd w:val="clear" w:color="auto" w:fill="B7B7B7"/>
+        </w:rPr>
+        <w:t>5 Mini) at [8/17/2025]</w:t>
       </w:r>
     </w:p>
     <w:p>
@@ -1662,7 +1741,7 @@
         <w:spacing w:before="240" w:after="240"/>
       </w:pPr>
       <w:r>
-        <w:pict w14:anchorId="12E297CB">
+        <w:pict w14:anchorId="483F3689">
           <v:rect id="_x0000_i1032" style="width:0;height:1.5pt" o:hralign="center" o:hrstd="t" o:hr="t" fillcolor="#a0a0a0" stroked="f"/>
         </w:pict>
       </w:r>
@@ -1696,21 +1775,12 @@
         </w:rPr>
         <w:t xml:space="preserve">: </w:t>
       </w:r>
-      <w:proofErr w:type="spellStart"/>
-      <w:r>
-        <w:rPr>
-          <w:b/>
-          <w:shd w:val="clear" w:color="auto" w:fill="B7B7B7"/>
-        </w:rPr>
-        <w:t>Chatgpt</w:t>
-      </w:r>
-      <w:proofErr w:type="spellEnd"/>
-      <w:r>
-        <w:rPr>
-          <w:b/>
-          <w:shd w:val="clear" w:color="auto" w:fill="B7B7B7"/>
-        </w:rPr>
-        <w:t xml:space="preserve"> </w:t>
+      <w:r>
+        <w:rPr>
+          <w:b/>
+          <w:shd w:val="clear" w:color="auto" w:fill="B7B7B7"/>
+        </w:rPr>
+        <w:t xml:space="preserve">Chatgpt </w:t>
       </w:r>
       <w:r>
         <w:rPr>
@@ -1719,7 +1789,26 @@
           <w:szCs w:val="14"/>
           <w:shd w:val="clear" w:color="auto" w:fill="B7B7B7"/>
         </w:rPr>
-        <w:t>(GPT-5-Standard) at [8/17/2025]</w:t>
+        <w:t>(GPT</w:t>
+      </w:r>
+      <w:r>
+        <w:rPr>
+          <w:rFonts w:ascii="Cambria Math" w:hAnsi="Cambria Math" w:cs="Cambria Math"/>
+          <w:b/>
+          <w:sz w:val="14"/>
+          <w:szCs w:val="14"/>
+          <w:shd w:val="clear" w:color="auto" w:fill="B7B7B7"/>
+        </w:rPr>
+        <w:t>‑</w:t>
+      </w:r>
+      <w:r>
+        <w:rPr>
+          <w:b/>
+          <w:sz w:val="14"/>
+          <w:szCs w:val="14"/>
+          <w:shd w:val="clear" w:color="auto" w:fill="B7B7B7"/>
+        </w:rPr>
+        <w:t>5 Mini) at [8/17/2025]</w:t>
       </w:r>
     </w:p>
     <w:p>
@@ -1970,7 +2059,7 @@
         <w:spacing w:before="240" w:after="240"/>
       </w:pPr>
       <w:r>
-        <w:pict w14:anchorId="4B84832B">
+        <w:pict w14:anchorId="3C1BF040">
           <v:rect id="_x0000_i1033" style="width:0;height:1.5pt" o:hralign="center" o:hrstd="t" o:hr="t" fillcolor="#a0a0a0" stroked="f"/>
         </w:pict>
       </w:r>
@@ -2004,21 +2093,12 @@
         </w:rPr>
         <w:t xml:space="preserve">: </w:t>
       </w:r>
-      <w:proofErr w:type="spellStart"/>
-      <w:r>
-        <w:rPr>
-          <w:b/>
-          <w:shd w:val="clear" w:color="auto" w:fill="B7B7B7"/>
-        </w:rPr>
-        <w:t>Chatgpt</w:t>
-      </w:r>
-      <w:proofErr w:type="spellEnd"/>
-      <w:r>
-        <w:rPr>
-          <w:b/>
-          <w:shd w:val="clear" w:color="auto" w:fill="B7B7B7"/>
-        </w:rPr>
-        <w:t xml:space="preserve"> </w:t>
+      <w:r>
+        <w:rPr>
+          <w:b/>
+          <w:shd w:val="clear" w:color="auto" w:fill="B7B7B7"/>
+        </w:rPr>
+        <w:t xml:space="preserve">Chatgpt </w:t>
       </w:r>
       <w:r>
         <w:rPr>
@@ -2027,7 +2107,26 @@
           <w:szCs w:val="14"/>
           <w:shd w:val="clear" w:color="auto" w:fill="B7B7B7"/>
         </w:rPr>
-        <w:t>(GPT-5-Standard) at [8/17/2025]</w:t>
+        <w:t>(GPT</w:t>
+      </w:r>
+      <w:r>
+        <w:rPr>
+          <w:rFonts w:ascii="Cambria Math" w:hAnsi="Cambria Math" w:cs="Cambria Math"/>
+          <w:b/>
+          <w:sz w:val="14"/>
+          <w:szCs w:val="14"/>
+          <w:shd w:val="clear" w:color="auto" w:fill="B7B7B7"/>
+        </w:rPr>
+        <w:t>‑</w:t>
+      </w:r>
+      <w:r>
+        <w:rPr>
+          <w:b/>
+          <w:sz w:val="14"/>
+          <w:szCs w:val="14"/>
+          <w:shd w:val="clear" w:color="auto" w:fill="B7B7B7"/>
+        </w:rPr>
+        <w:t>5 Mini) at [8/17/2025]</w:t>
       </w:r>
     </w:p>
     <w:p>
@@ -2197,7 +2296,7 @@
         <w:spacing w:before="240" w:after="240"/>
       </w:pPr>
       <w:r>
-        <w:pict w14:anchorId="00E8E1C8">
+        <w:pict w14:anchorId="16DC8FDC">
           <v:rect id="_x0000_i1034" style="width:0;height:1.5pt" o:hralign="center" o:hrstd="t" o:hr="t" fillcolor="#a0a0a0" stroked="f"/>
         </w:pict>
       </w:r>
@@ -2231,21 +2330,12 @@
         </w:rPr>
         <w:t xml:space="preserve">: </w:t>
       </w:r>
-      <w:proofErr w:type="spellStart"/>
-      <w:r>
-        <w:rPr>
-          <w:b/>
-          <w:shd w:val="clear" w:color="auto" w:fill="B7B7B7"/>
-        </w:rPr>
-        <w:t>Chatgpt</w:t>
-      </w:r>
-      <w:proofErr w:type="spellEnd"/>
-      <w:r>
-        <w:rPr>
-          <w:b/>
-          <w:shd w:val="clear" w:color="auto" w:fill="B7B7B7"/>
-        </w:rPr>
-        <w:t xml:space="preserve"> </w:t>
+      <w:r>
+        <w:rPr>
+          <w:b/>
+          <w:shd w:val="clear" w:color="auto" w:fill="B7B7B7"/>
+        </w:rPr>
+        <w:t xml:space="preserve">Chatgpt </w:t>
       </w:r>
       <w:r>
         <w:rPr>
@@ -2254,7 +2344,26 @@
           <w:szCs w:val="14"/>
           <w:shd w:val="clear" w:color="auto" w:fill="B7B7B7"/>
         </w:rPr>
-        <w:t>(GPT-5-Standard) at [8/17/2025]</w:t>
+        <w:t>(GPT</w:t>
+      </w:r>
+      <w:r>
+        <w:rPr>
+          <w:rFonts w:ascii="Cambria Math" w:hAnsi="Cambria Math" w:cs="Cambria Math"/>
+          <w:b/>
+          <w:sz w:val="14"/>
+          <w:szCs w:val="14"/>
+          <w:shd w:val="clear" w:color="auto" w:fill="B7B7B7"/>
+        </w:rPr>
+        <w:t>‑</w:t>
+      </w:r>
+      <w:r>
+        <w:rPr>
+          <w:b/>
+          <w:sz w:val="14"/>
+          <w:szCs w:val="14"/>
+          <w:shd w:val="clear" w:color="auto" w:fill="B7B7B7"/>
+        </w:rPr>
+        <w:t>5 Mini) at [8/17/2025]</w:t>
       </w:r>
     </w:p>
     <w:p>
@@ -2270,7 +2379,6 @@
           <w:rFonts w:ascii="Roboto Mono" w:eastAsia="Roboto Mono" w:hAnsi="Roboto Mono" w:cs="Roboto Mono"/>
           <w:b/>
         </w:rPr>
-        <w:lastRenderedPageBreak/>
         <w:t>Why:</w:t>
       </w:r>
       <w:r>
@@ -2301,6 +2409,7 @@
           <w:rFonts w:ascii="Roboto Mono" w:eastAsia="Roboto Mono" w:hAnsi="Roboto Mono" w:cs="Roboto Mono"/>
           <w:b/>
         </w:rPr>
+        <w:lastRenderedPageBreak/>
         <w:t>Example:</w:t>
       </w:r>
       <w:r>
@@ -2386,7 +2495,7 @@
         <w:spacing w:before="240" w:after="240"/>
       </w:pPr>
       <w:r>
-        <w:pict w14:anchorId="30DF0560">
+        <w:pict w14:anchorId="26879EC6">
           <v:rect id="_x0000_i1035" style="width:0;height:1.5pt" o:hralign="center" o:hrstd="t" o:hr="t" fillcolor="#a0a0a0" stroked="f"/>
         </w:pict>
       </w:r>
@@ -2420,21 +2529,12 @@
         </w:rPr>
         <w:t xml:space="preserve">: </w:t>
       </w:r>
-      <w:proofErr w:type="spellStart"/>
-      <w:r>
-        <w:rPr>
-          <w:b/>
-          <w:shd w:val="clear" w:color="auto" w:fill="B7B7B7"/>
-        </w:rPr>
-        <w:t>Chatgpt</w:t>
-      </w:r>
-      <w:proofErr w:type="spellEnd"/>
-      <w:r>
-        <w:rPr>
-          <w:b/>
-          <w:shd w:val="clear" w:color="auto" w:fill="B7B7B7"/>
-        </w:rPr>
-        <w:t xml:space="preserve"> </w:t>
+      <w:r>
+        <w:rPr>
+          <w:b/>
+          <w:shd w:val="clear" w:color="auto" w:fill="B7B7B7"/>
+        </w:rPr>
+        <w:t xml:space="preserve">Chatgpt </w:t>
       </w:r>
       <w:r>
         <w:rPr>
@@ -2443,7 +2543,26 @@
           <w:szCs w:val="14"/>
           <w:shd w:val="clear" w:color="auto" w:fill="B7B7B7"/>
         </w:rPr>
-        <w:t>(GPT-5-Standard) at [8/17/2025]</w:t>
+        <w:t>(GPT</w:t>
+      </w:r>
+      <w:r>
+        <w:rPr>
+          <w:rFonts w:ascii="Cambria Math" w:hAnsi="Cambria Math" w:cs="Cambria Math"/>
+          <w:b/>
+          <w:sz w:val="14"/>
+          <w:szCs w:val="14"/>
+          <w:shd w:val="clear" w:color="auto" w:fill="B7B7B7"/>
+        </w:rPr>
+        <w:t>‑</w:t>
+      </w:r>
+      <w:r>
+        <w:rPr>
+          <w:b/>
+          <w:sz w:val="14"/>
+          <w:szCs w:val="14"/>
+          <w:shd w:val="clear" w:color="auto" w:fill="B7B7B7"/>
+        </w:rPr>
+        <w:t>5 Mini) at [8/17/2025]</w:t>
       </w:r>
     </w:p>
     <w:p>
@@ -2551,7 +2670,7 @@
         <w:spacing w:before="240" w:after="240"/>
       </w:pPr>
       <w:r>
-        <w:pict w14:anchorId="6A786A19">
+        <w:pict w14:anchorId="3BE2E015">
           <v:rect id="_x0000_i1036" style="width:0;height:1.5pt" o:hralign="center" o:hrstd="t" o:hr="t" fillcolor="#a0a0a0" stroked="f"/>
         </w:pict>
       </w:r>
@@ -2588,21 +2707,12 @@
         </w:rPr>
         <w:t xml:space="preserve">: </w:t>
       </w:r>
-      <w:proofErr w:type="spellStart"/>
-      <w:r>
-        <w:rPr>
-          <w:b/>
-          <w:shd w:val="clear" w:color="auto" w:fill="B7B7B7"/>
-        </w:rPr>
-        <w:t>Chatgpt</w:t>
-      </w:r>
-      <w:proofErr w:type="spellEnd"/>
-      <w:r>
-        <w:rPr>
-          <w:b/>
-          <w:shd w:val="clear" w:color="auto" w:fill="B7B7B7"/>
-        </w:rPr>
-        <w:t xml:space="preserve"> </w:t>
+      <w:r>
+        <w:rPr>
+          <w:b/>
+          <w:shd w:val="clear" w:color="auto" w:fill="B7B7B7"/>
+        </w:rPr>
+        <w:t xml:space="preserve">Chatgpt </w:t>
       </w:r>
       <w:r>
         <w:rPr>
@@ -2611,7 +2721,26 @@
           <w:szCs w:val="14"/>
           <w:shd w:val="clear" w:color="auto" w:fill="B7B7B7"/>
         </w:rPr>
-        <w:t>(GPT-5-Standard) at [8/17/2025]</w:t>
+        <w:t>(GPT</w:t>
+      </w:r>
+      <w:r>
+        <w:rPr>
+          <w:rFonts w:ascii="Cambria Math" w:hAnsi="Cambria Math" w:cs="Cambria Math"/>
+          <w:b/>
+          <w:sz w:val="14"/>
+          <w:szCs w:val="14"/>
+          <w:shd w:val="clear" w:color="auto" w:fill="B7B7B7"/>
+        </w:rPr>
+        <w:t>‑</w:t>
+      </w:r>
+      <w:r>
+        <w:rPr>
+          <w:b/>
+          <w:sz w:val="14"/>
+          <w:szCs w:val="14"/>
+          <w:shd w:val="clear" w:color="auto" w:fill="B7B7B7"/>
+        </w:rPr>
+        <w:t>5 Mini) at [8/17/2025]</w:t>
       </w:r>
     </w:p>
     <w:p>
@@ -2661,7 +2790,7 @@
         <w:spacing w:before="240" w:after="240"/>
       </w:pPr>
       <w:r>
-        <w:pict w14:anchorId="187A7DBC">
+        <w:pict w14:anchorId="09BB4A6B">
           <v:rect id="_x0000_i1037" style="width:0;height:1.5pt" o:hralign="center" o:hrstd="t" o:hr="t" fillcolor="#a0a0a0" stroked="f"/>
         </w:pict>
       </w:r>
@@ -2677,7 +2806,6 @@
         <w:rPr>
           <w:rFonts w:ascii="Arial Unicode MS" w:eastAsia="Arial Unicode MS" w:hAnsi="Arial Unicode MS" w:cs="Arial Unicode MS"/>
         </w:rPr>
-        <w:lastRenderedPageBreak/>
         <w:t>⚡ Example in One Line:</w:t>
       </w:r>
     </w:p>
@@ -2716,7 +2844,14 @@
         <w:rPr>
           <w:rFonts w:ascii="Roboto Mono" w:eastAsia="Roboto Mono" w:hAnsi="Roboto Mono" w:cs="Roboto Mono"/>
         </w:rPr>
-        <w:t xml:space="preserve"> are tested within 4 weeks using a </w:t>
+        <w:t xml:space="preserve"> are tested within 4 </w:t>
+      </w:r>
+      <w:r>
+        <w:rPr>
+          <w:rFonts w:ascii="Roboto Mono" w:eastAsia="Roboto Mono" w:hAnsi="Roboto Mono" w:cs="Roboto Mono"/>
+        </w:rPr>
+        <w:lastRenderedPageBreak/>
+        <w:t xml:space="preserve">weeks using a </w:t>
       </w:r>
       <w:r>
         <w:rPr>
@@ -2734,7 +2869,7 @@
     </w:p>
     <w:p>
       <w:r>
-        <w:pict w14:anchorId="5FA97521">
+        <w:pict w14:anchorId="7122949A">
           <v:rect id="_x0000_i1038" style="width:0;height:1.5pt" o:hralign="center" o:hrstd="t" o:hr="t" fillcolor="#a0a0a0" stroked="f"/>
         </w:pict>
       </w:r>
@@ -2769,21 +2904,12 @@
         </w:rPr>
         <w:t xml:space="preserve">: </w:t>
       </w:r>
-      <w:proofErr w:type="spellStart"/>
-      <w:r>
-        <w:rPr>
-          <w:b/>
-          <w:shd w:val="clear" w:color="auto" w:fill="B7B7B7"/>
-        </w:rPr>
-        <w:t>Chatgpt</w:t>
-      </w:r>
-      <w:proofErr w:type="spellEnd"/>
-      <w:r>
-        <w:rPr>
-          <w:b/>
-          <w:shd w:val="clear" w:color="auto" w:fill="B7B7B7"/>
-        </w:rPr>
-        <w:t xml:space="preserve"> </w:t>
+      <w:r>
+        <w:rPr>
+          <w:b/>
+          <w:shd w:val="clear" w:color="auto" w:fill="B7B7B7"/>
+        </w:rPr>
+        <w:t xml:space="preserve">Chatgpt </w:t>
       </w:r>
       <w:r>
         <w:rPr>
@@ -2792,7 +2918,26 @@
           <w:szCs w:val="14"/>
           <w:shd w:val="clear" w:color="auto" w:fill="B7B7B7"/>
         </w:rPr>
-        <w:t>(GPT-5-Standard) at [8/17/2025]</w:t>
+        <w:t>(GPT</w:t>
+      </w:r>
+      <w:r>
+        <w:rPr>
+          <w:rFonts w:ascii="Cambria Math" w:hAnsi="Cambria Math" w:cs="Cambria Math"/>
+          <w:b/>
+          <w:sz w:val="14"/>
+          <w:szCs w:val="14"/>
+          <w:shd w:val="clear" w:color="auto" w:fill="B7B7B7"/>
+        </w:rPr>
+        <w:t>‑</w:t>
+      </w:r>
+      <w:r>
+        <w:rPr>
+          <w:b/>
+          <w:sz w:val="14"/>
+          <w:szCs w:val="14"/>
+          <w:shd w:val="clear" w:color="auto" w:fill="B7B7B7"/>
+        </w:rPr>
+        <w:t>5 Mini) at [8/17/2025]</w:t>
       </w:r>
     </w:p>
     <w:p>
@@ -2970,7 +3115,7 @@
         <w:spacing w:after="80"/>
       </w:pPr>
       <w:r>
-        <w:pict w14:anchorId="5E9E4748">
+        <w:pict w14:anchorId="56ABDED1">
           <v:rect id="_x0000_i1039" style="width:0;height:1.5pt" o:hralign="center" o:hrstd="t" o:hr="t" fillcolor="#a0a0a0" stroked="f"/>
         </w:pict>
       </w:r>
@@ -3004,21 +3149,12 @@
         </w:rPr>
         <w:t xml:space="preserve">: </w:t>
       </w:r>
-      <w:proofErr w:type="spellStart"/>
-      <w:r>
-        <w:rPr>
-          <w:b/>
-          <w:shd w:val="clear" w:color="auto" w:fill="B7B7B7"/>
-        </w:rPr>
-        <w:t>Chatgpt</w:t>
-      </w:r>
-      <w:proofErr w:type="spellEnd"/>
-      <w:r>
-        <w:rPr>
-          <w:b/>
-          <w:shd w:val="clear" w:color="auto" w:fill="B7B7B7"/>
-        </w:rPr>
-        <w:t xml:space="preserve"> </w:t>
+      <w:r>
+        <w:rPr>
+          <w:b/>
+          <w:shd w:val="clear" w:color="auto" w:fill="B7B7B7"/>
+        </w:rPr>
+        <w:t xml:space="preserve">Chatgpt </w:t>
       </w:r>
       <w:r>
         <w:rPr>
@@ -3027,7 +3163,26 @@
           <w:szCs w:val="14"/>
           <w:shd w:val="clear" w:color="auto" w:fill="B7B7B7"/>
         </w:rPr>
-        <w:t>(GPT-5-Standard) at [8/17/2025]</w:t>
+        <w:t>(GPT</w:t>
+      </w:r>
+      <w:r>
+        <w:rPr>
+          <w:rFonts w:ascii="Cambria Math" w:hAnsi="Cambria Math" w:cs="Cambria Math"/>
+          <w:b/>
+          <w:sz w:val="14"/>
+          <w:szCs w:val="14"/>
+          <w:shd w:val="clear" w:color="auto" w:fill="B7B7B7"/>
+        </w:rPr>
+        <w:t>‑</w:t>
+      </w:r>
+      <w:r>
+        <w:rPr>
+          <w:b/>
+          <w:sz w:val="14"/>
+          <w:szCs w:val="14"/>
+          <w:shd w:val="clear" w:color="auto" w:fill="B7B7B7"/>
+        </w:rPr>
+        <w:t>5 Mini) at [8/17/2025]</w:t>
       </w:r>
     </w:p>
     <w:p>
@@ -3132,7 +3287,6 @@
         <w:rPr>
           <w:rFonts w:ascii="Arial Unicode MS" w:eastAsia="Arial Unicode MS" w:hAnsi="Arial Unicode MS" w:cs="Arial Unicode MS"/>
         </w:rPr>
-        <w:lastRenderedPageBreak/>
         <w:t xml:space="preserve">✅ </w:t>
       </w:r>
       <w:r>
@@ -3167,7 +3321,7 @@
         <w:spacing w:after="80"/>
       </w:pPr>
       <w:r>
-        <w:pict w14:anchorId="304864AF">
+        <w:pict w14:anchorId="1A8FCFF8">
           <v:rect id="_x0000_i1040" style="width:0;height:1.5pt" o:hralign="center" o:hrstd="t" o:hr="t" fillcolor="#a0a0a0" stroked="f"/>
         </w:pict>
       </w:r>
@@ -3181,6 +3335,7 @@
       <w:bookmarkStart w:id="19" w:name="_fifq977kz488" w:colFirst="0" w:colLast="0"/>
       <w:bookmarkEnd w:id="19"/>
       <w:r>
+        <w:lastRenderedPageBreak/>
         <w:t>3. Project Manager / Delivery Manager</w:t>
       </w:r>
     </w:p>
@@ -3201,21 +3356,12 @@
         </w:rPr>
         <w:t xml:space="preserve">: </w:t>
       </w:r>
-      <w:proofErr w:type="spellStart"/>
-      <w:r>
-        <w:rPr>
-          <w:b/>
-          <w:shd w:val="clear" w:color="auto" w:fill="B7B7B7"/>
-        </w:rPr>
-        <w:t>Chatgpt</w:t>
-      </w:r>
-      <w:proofErr w:type="spellEnd"/>
-      <w:r>
-        <w:rPr>
-          <w:b/>
-          <w:shd w:val="clear" w:color="auto" w:fill="B7B7B7"/>
-        </w:rPr>
-        <w:t xml:space="preserve"> </w:t>
+      <w:r>
+        <w:rPr>
+          <w:b/>
+          <w:shd w:val="clear" w:color="auto" w:fill="B7B7B7"/>
+        </w:rPr>
+        <w:t xml:space="preserve">Chatgpt </w:t>
       </w:r>
       <w:r>
         <w:rPr>
@@ -3224,7 +3370,26 @@
           <w:szCs w:val="14"/>
           <w:shd w:val="clear" w:color="auto" w:fill="B7B7B7"/>
         </w:rPr>
-        <w:t>(GPT-5-Standard) at [8/17/2025]</w:t>
+        <w:t>(GPT</w:t>
+      </w:r>
+      <w:r>
+        <w:rPr>
+          <w:rFonts w:ascii="Cambria Math" w:hAnsi="Cambria Math" w:cs="Cambria Math"/>
+          <w:b/>
+          <w:sz w:val="14"/>
+          <w:szCs w:val="14"/>
+          <w:shd w:val="clear" w:color="auto" w:fill="B7B7B7"/>
+        </w:rPr>
+        <w:t>‑</w:t>
+      </w:r>
+      <w:r>
+        <w:rPr>
+          <w:b/>
+          <w:sz w:val="14"/>
+          <w:szCs w:val="14"/>
+          <w:shd w:val="clear" w:color="auto" w:fill="B7B7B7"/>
+        </w:rPr>
+        <w:t>5 Mini) at [8/17/2025]</w:t>
       </w:r>
     </w:p>
     <w:p>
@@ -3353,7 +3518,7 @@
         <w:spacing w:after="80"/>
       </w:pPr>
       <w:r>
-        <w:pict w14:anchorId="54191C46">
+        <w:pict w14:anchorId="1A2A20FB">
           <v:rect id="_x0000_i1041" style="width:0;height:1.5pt" o:hralign="center" o:hrstd="t" o:hr="t" fillcolor="#a0a0a0" stroked="f"/>
         </w:pict>
       </w:r>
@@ -3387,21 +3552,12 @@
         </w:rPr>
         <w:t xml:space="preserve">: </w:t>
       </w:r>
-      <w:proofErr w:type="spellStart"/>
-      <w:r>
-        <w:rPr>
-          <w:b/>
-          <w:shd w:val="clear" w:color="auto" w:fill="B7B7B7"/>
-        </w:rPr>
-        <w:t>Chatgpt</w:t>
-      </w:r>
-      <w:proofErr w:type="spellEnd"/>
-      <w:r>
-        <w:rPr>
-          <w:b/>
-          <w:shd w:val="clear" w:color="auto" w:fill="B7B7B7"/>
-        </w:rPr>
-        <w:t xml:space="preserve"> </w:t>
+      <w:r>
+        <w:rPr>
+          <w:b/>
+          <w:shd w:val="clear" w:color="auto" w:fill="B7B7B7"/>
+        </w:rPr>
+        <w:t xml:space="preserve">Chatgpt </w:t>
       </w:r>
       <w:r>
         <w:rPr>
@@ -3410,7 +3566,26 @@
           <w:szCs w:val="14"/>
           <w:shd w:val="clear" w:color="auto" w:fill="B7B7B7"/>
         </w:rPr>
-        <w:t>(GPT-5-Standard) at [8/17/2025]</w:t>
+        <w:t>(GPT</w:t>
+      </w:r>
+      <w:r>
+        <w:rPr>
+          <w:rFonts w:ascii="Cambria Math" w:hAnsi="Cambria Math" w:cs="Cambria Math"/>
+          <w:b/>
+          <w:sz w:val="14"/>
+          <w:szCs w:val="14"/>
+          <w:shd w:val="clear" w:color="auto" w:fill="B7B7B7"/>
+        </w:rPr>
+        <w:t>‑</w:t>
+      </w:r>
+      <w:r>
+        <w:rPr>
+          <w:b/>
+          <w:sz w:val="14"/>
+          <w:szCs w:val="14"/>
+          <w:shd w:val="clear" w:color="auto" w:fill="B7B7B7"/>
+        </w:rPr>
+        <w:t>5 Mini) at [8/17/2025]</w:t>
       </w:r>
     </w:p>
     <w:p>
@@ -3526,7 +3701,7 @@
         <w:spacing w:after="80"/>
       </w:pPr>
       <w:r>
-        <w:pict w14:anchorId="6CFE8FD0">
+        <w:pict w14:anchorId="5D400663">
           <v:rect id="_x0000_i1042" style="width:0;height:1.5pt" o:hralign="center" o:hrstd="t" o:hr="t" fillcolor="#a0a0a0" stroked="f"/>
         </w:pict>
       </w:r>
@@ -3560,21 +3735,12 @@
         </w:rPr>
         <w:t xml:space="preserve">: </w:t>
       </w:r>
-      <w:proofErr w:type="spellStart"/>
-      <w:r>
-        <w:rPr>
-          <w:b/>
-          <w:shd w:val="clear" w:color="auto" w:fill="B7B7B7"/>
-        </w:rPr>
-        <w:t>Chatgpt</w:t>
-      </w:r>
-      <w:proofErr w:type="spellEnd"/>
-      <w:r>
-        <w:rPr>
-          <w:b/>
-          <w:shd w:val="clear" w:color="auto" w:fill="B7B7B7"/>
-        </w:rPr>
-        <w:t xml:space="preserve"> </w:t>
+      <w:r>
+        <w:rPr>
+          <w:b/>
+          <w:shd w:val="clear" w:color="auto" w:fill="B7B7B7"/>
+        </w:rPr>
+        <w:t xml:space="preserve">Chatgpt </w:t>
       </w:r>
       <w:r>
         <w:rPr>
@@ -3583,7 +3749,26 @@
           <w:szCs w:val="14"/>
           <w:shd w:val="clear" w:color="auto" w:fill="B7B7B7"/>
         </w:rPr>
-        <w:t>(GPT-5-Standard) at [8/17/2025]</w:t>
+        <w:t>(GPT</w:t>
+      </w:r>
+      <w:r>
+        <w:rPr>
+          <w:rFonts w:ascii="Cambria Math" w:hAnsi="Cambria Math" w:cs="Cambria Math"/>
+          <w:b/>
+          <w:sz w:val="14"/>
+          <w:szCs w:val="14"/>
+          <w:shd w:val="clear" w:color="auto" w:fill="B7B7B7"/>
+        </w:rPr>
+        <w:t>‑</w:t>
+      </w:r>
+      <w:r>
+        <w:rPr>
+          <w:b/>
+          <w:sz w:val="14"/>
+          <w:szCs w:val="14"/>
+          <w:shd w:val="clear" w:color="auto" w:fill="B7B7B7"/>
+        </w:rPr>
+        <w:t>5 Mini) at [8/17/2025]</w:t>
       </w:r>
     </w:p>
     <w:p>
@@ -3635,62 +3820,62 @@
         <w:rPr>
           <w:rFonts w:ascii="Roboto Mono" w:eastAsia="Roboto Mono" w:hAnsi="Roboto Mono" w:cs="Roboto Mono"/>
         </w:rPr>
+        <w:t xml:space="preserve">Helps define what </w:t>
+      </w:r>
+      <w:r>
+        <w:rPr>
+          <w:rFonts w:ascii="Roboto Mono" w:eastAsia="Roboto Mono" w:hAnsi="Roboto Mono" w:cs="Roboto Mono"/>
+          <w:i/>
+        </w:rPr>
+        <w:t>cannot</w:t>
+      </w:r>
+      <w:r>
+        <w:rPr>
+          <w:rFonts w:ascii="Roboto Mono" w:eastAsia="Roboto Mono" w:hAnsi="Roboto Mono" w:cs="Roboto Mono"/>
+        </w:rPr>
+        <w:t xml:space="preserve"> be tested easily due to dependencies.</w:t>
+      </w:r>
+      <w:r>
+        <w:rPr>
+          <w:rFonts w:ascii="Roboto Mono" w:eastAsia="Roboto Mono" w:hAnsi="Roboto Mono" w:cs="Roboto Mono"/>
+        </w:rPr>
+        <w:br/>
+      </w:r>
+    </w:p>
+    <w:p>
+      <w:pPr>
+        <w:spacing w:before="240" w:after="240"/>
+        <w:rPr>
+          <w:rFonts w:ascii="Roboto Mono" w:eastAsia="Roboto Mono" w:hAnsi="Roboto Mono" w:cs="Roboto Mono"/>
+        </w:rPr>
+      </w:pPr>
+      <w:r>
+        <w:rPr>
+          <w:rFonts w:ascii="Arial Unicode MS" w:eastAsia="Arial Unicode MS" w:hAnsi="Arial Unicode MS" w:cs="Arial Unicode MS"/>
+        </w:rPr>
+        <w:t xml:space="preserve">✅ </w:t>
+      </w:r>
+      <w:r>
+        <w:rPr>
+          <w:rFonts w:ascii="Roboto Mono" w:eastAsia="Roboto Mono" w:hAnsi="Roboto Mono" w:cs="Roboto Mono"/>
+          <w:i/>
+        </w:rPr>
+        <w:t>Example:</w:t>
+      </w:r>
+      <w:r>
+        <w:rPr>
+          <w:rFonts w:ascii="Roboto Mono" w:eastAsia="Roboto Mono" w:hAnsi="Roboto Mono" w:cs="Roboto Mono"/>
+        </w:rPr>
+        <w:t xml:space="preserve"> Developers inform QA that third-party APIs are unstable, so testing will use mock services.</w:t>
+      </w:r>
+    </w:p>
+    <w:p>
+      <w:pPr>
+        <w:spacing w:after="80"/>
+      </w:pPr>
+      <w:r>
         <w:lastRenderedPageBreak/>
-        <w:t xml:space="preserve">Helps define what </w:t>
-      </w:r>
-      <w:r>
-        <w:rPr>
-          <w:rFonts w:ascii="Roboto Mono" w:eastAsia="Roboto Mono" w:hAnsi="Roboto Mono" w:cs="Roboto Mono"/>
-          <w:i/>
-        </w:rPr>
-        <w:t>cannot</w:t>
-      </w:r>
-      <w:r>
-        <w:rPr>
-          <w:rFonts w:ascii="Roboto Mono" w:eastAsia="Roboto Mono" w:hAnsi="Roboto Mono" w:cs="Roboto Mono"/>
-        </w:rPr>
-        <w:t xml:space="preserve"> be tested easily due to dependencies.</w:t>
-      </w:r>
-      <w:r>
-        <w:rPr>
-          <w:rFonts w:ascii="Roboto Mono" w:eastAsia="Roboto Mono" w:hAnsi="Roboto Mono" w:cs="Roboto Mono"/>
-        </w:rPr>
-        <w:br/>
-      </w:r>
-    </w:p>
-    <w:p>
-      <w:pPr>
-        <w:spacing w:before="240" w:after="240"/>
-        <w:rPr>
-          <w:rFonts w:ascii="Roboto Mono" w:eastAsia="Roboto Mono" w:hAnsi="Roboto Mono" w:cs="Roboto Mono"/>
-        </w:rPr>
-      </w:pPr>
-      <w:r>
-        <w:rPr>
-          <w:rFonts w:ascii="Arial Unicode MS" w:eastAsia="Arial Unicode MS" w:hAnsi="Arial Unicode MS" w:cs="Arial Unicode MS"/>
-        </w:rPr>
-        <w:t xml:space="preserve">✅ </w:t>
-      </w:r>
-      <w:r>
-        <w:rPr>
-          <w:rFonts w:ascii="Roboto Mono" w:eastAsia="Roboto Mono" w:hAnsi="Roboto Mono" w:cs="Roboto Mono"/>
-          <w:i/>
-        </w:rPr>
-        <w:t>Example:</w:t>
-      </w:r>
-      <w:r>
-        <w:rPr>
-          <w:rFonts w:ascii="Roboto Mono" w:eastAsia="Roboto Mono" w:hAnsi="Roboto Mono" w:cs="Roboto Mono"/>
-        </w:rPr>
-        <w:t xml:space="preserve"> Developers inform QA that third-party APIs are unstable, so testing will use mock services.</w:t>
-      </w:r>
-    </w:p>
-    <w:p>
-      <w:pPr>
-        <w:spacing w:after="80"/>
-      </w:pPr>
-      <w:r>
-        <w:pict w14:anchorId="743B0E13">
+        <w:pict w14:anchorId="7C41EF8F">
           <v:rect id="_x0000_i1043" style="width:0;height:1.5pt" o:hralign="center" o:hrstd="t" o:hr="t" fillcolor="#a0a0a0" stroked="f"/>
         </w:pict>
       </w:r>
@@ -3724,21 +3909,12 @@
         </w:rPr>
         <w:t xml:space="preserve">: </w:t>
       </w:r>
-      <w:proofErr w:type="spellStart"/>
-      <w:r>
-        <w:rPr>
-          <w:b/>
-          <w:shd w:val="clear" w:color="auto" w:fill="B7B7B7"/>
-        </w:rPr>
-        <w:t>Chatgpt</w:t>
-      </w:r>
-      <w:proofErr w:type="spellEnd"/>
-      <w:r>
-        <w:rPr>
-          <w:b/>
-          <w:shd w:val="clear" w:color="auto" w:fill="B7B7B7"/>
-        </w:rPr>
-        <w:t xml:space="preserve"> </w:t>
+      <w:r>
+        <w:rPr>
+          <w:b/>
+          <w:shd w:val="clear" w:color="auto" w:fill="B7B7B7"/>
+        </w:rPr>
+        <w:t xml:space="preserve">Chatgpt </w:t>
       </w:r>
       <w:r>
         <w:rPr>
@@ -3747,7 +3923,26 @@
           <w:szCs w:val="14"/>
           <w:shd w:val="clear" w:color="auto" w:fill="B7B7B7"/>
         </w:rPr>
-        <w:t>(GPT-5-Standard) at [8/17/2025]</w:t>
+        <w:t>(GPT</w:t>
+      </w:r>
+      <w:r>
+        <w:rPr>
+          <w:rFonts w:ascii="Cambria Math" w:hAnsi="Cambria Math" w:cs="Cambria Math"/>
+          <w:b/>
+          <w:sz w:val="14"/>
+          <w:szCs w:val="14"/>
+          <w:shd w:val="clear" w:color="auto" w:fill="B7B7B7"/>
+        </w:rPr>
+        <w:t>‑</w:t>
+      </w:r>
+      <w:r>
+        <w:rPr>
+          <w:b/>
+          <w:sz w:val="14"/>
+          <w:szCs w:val="14"/>
+          <w:shd w:val="clear" w:color="auto" w:fill="B7B7B7"/>
+        </w:rPr>
+        <w:t>5 Mini) at [8/17/2025]</w:t>
       </w:r>
     </w:p>
     <w:p>
@@ -3863,7 +4058,7 @@
         <w:spacing w:after="80"/>
       </w:pPr>
       <w:r>
-        <w:pict w14:anchorId="47C4BD3E">
+        <w:pict w14:anchorId="08903ADC">
           <v:rect id="_x0000_i1044" style="width:0;height:1.5pt" o:hralign="center" o:hrstd="t" o:hr="t" fillcolor="#a0a0a0" stroked="f"/>
         </w:pict>
       </w:r>
@@ -3898,21 +4093,12 @@
         </w:rPr>
         <w:t xml:space="preserve">: </w:t>
       </w:r>
-      <w:proofErr w:type="spellStart"/>
-      <w:r>
-        <w:rPr>
-          <w:b/>
-          <w:shd w:val="clear" w:color="auto" w:fill="B7B7B7"/>
-        </w:rPr>
-        <w:t>Chatgpt</w:t>
-      </w:r>
-      <w:proofErr w:type="spellEnd"/>
-      <w:r>
-        <w:rPr>
-          <w:b/>
-          <w:shd w:val="clear" w:color="auto" w:fill="B7B7B7"/>
-        </w:rPr>
-        <w:t xml:space="preserve"> </w:t>
+      <w:r>
+        <w:rPr>
+          <w:b/>
+          <w:shd w:val="clear" w:color="auto" w:fill="B7B7B7"/>
+        </w:rPr>
+        <w:t xml:space="preserve">Chatgpt </w:t>
       </w:r>
       <w:r>
         <w:rPr>
@@ -3921,7 +4107,26 @@
           <w:szCs w:val="14"/>
           <w:shd w:val="clear" w:color="auto" w:fill="B7B7B7"/>
         </w:rPr>
-        <w:t>(GPT-5-Standard) at [8/17/2025]</w:t>
+        <w:t>(GPT</w:t>
+      </w:r>
+      <w:r>
+        <w:rPr>
+          <w:rFonts w:ascii="Cambria Math" w:hAnsi="Cambria Math" w:cs="Cambria Math"/>
+          <w:b/>
+          <w:sz w:val="14"/>
+          <w:szCs w:val="14"/>
+          <w:shd w:val="clear" w:color="auto" w:fill="B7B7B7"/>
+        </w:rPr>
+        <w:t>‑</w:t>
+      </w:r>
+      <w:r>
+        <w:rPr>
+          <w:b/>
+          <w:sz w:val="14"/>
+          <w:szCs w:val="14"/>
+          <w:shd w:val="clear" w:color="auto" w:fill="B7B7B7"/>
+        </w:rPr>
+        <w:t>5 Mini) at [8/17/2025]</w:t>
       </w:r>
     </w:p>
     <w:p>
@@ -4012,7 +4217,7 @@
         <w:spacing w:after="80"/>
       </w:pPr>
       <w:r>
-        <w:pict w14:anchorId="4999B98F">
+        <w:pict w14:anchorId="202ED1C8">
           <v:rect id="_x0000_i1045" style="width:0;height:1.5pt" o:hralign="center" o:hrstd="t" o:hr="t" fillcolor="#a0a0a0" stroked="f"/>
         </w:pict>
       </w:r>
@@ -4023,7 +4228,6 @@
         <w:pStyle w:val="Heading2"/>
         <w:keepNext w:val="0"/>
         <w:keepLines w:val="0"/>
-        <w:spacing w:after="80"/>
         <w:rPr>
           <w:b/>
           <w:sz w:val="34"/>
@@ -4050,7 +4254,6 @@
           <w:b/>
           <w:shd w:val="clear" w:color="auto" w:fill="B7B7B7"/>
         </w:rPr>
-        <w:lastRenderedPageBreak/>
         <w:t># Source</w:t>
       </w:r>
       <w:r>
@@ -4059,21 +4262,12 @@
         </w:rPr>
         <w:t xml:space="preserve">: </w:t>
       </w:r>
-      <w:proofErr w:type="spellStart"/>
-      <w:r>
-        <w:rPr>
-          <w:b/>
-          <w:shd w:val="clear" w:color="auto" w:fill="B7B7B7"/>
-        </w:rPr>
-        <w:t>Chatgpt</w:t>
-      </w:r>
-      <w:proofErr w:type="spellEnd"/>
-      <w:r>
-        <w:rPr>
-          <w:b/>
-          <w:shd w:val="clear" w:color="auto" w:fill="B7B7B7"/>
-        </w:rPr>
-        <w:t xml:space="preserve"> </w:t>
+      <w:r>
+        <w:rPr>
+          <w:b/>
+          <w:shd w:val="clear" w:color="auto" w:fill="B7B7B7"/>
+        </w:rPr>
+        <w:t xml:space="preserve">Chatgpt </w:t>
       </w:r>
       <w:r>
         <w:rPr>
@@ -4082,7 +4276,26 @@
           <w:szCs w:val="14"/>
           <w:shd w:val="clear" w:color="auto" w:fill="B7B7B7"/>
         </w:rPr>
-        <w:t>(GPT-5-Standard) at [8/17/2025]</w:t>
+        <w:t>(GPT</w:t>
+      </w:r>
+      <w:r>
+        <w:rPr>
+          <w:rFonts w:ascii="Cambria Math" w:hAnsi="Cambria Math" w:cs="Cambria Math"/>
+          <w:b/>
+          <w:sz w:val="14"/>
+          <w:szCs w:val="14"/>
+          <w:shd w:val="clear" w:color="auto" w:fill="B7B7B7"/>
+        </w:rPr>
+        <w:t>‑</w:t>
+      </w:r>
+      <w:r>
+        <w:rPr>
+          <w:b/>
+          <w:sz w:val="14"/>
+          <w:szCs w:val="14"/>
+          <w:shd w:val="clear" w:color="auto" w:fill="B7B7B7"/>
+        </w:rPr>
+        <w:t>5 Mini) at [8/17/2025]</w:t>
       </w:r>
     </w:p>
     <w:p>
@@ -4173,6 +4386,7 @@
         <w:rPr>
           <w:rFonts w:ascii="Roboto Mono" w:eastAsia="Roboto Mono" w:hAnsi="Roboto Mono" w:cs="Roboto Mono"/>
         </w:rPr>
+        <w:lastRenderedPageBreak/>
         <w:t>Purpose of the test plan and objectives of testing.</w:t>
       </w:r>
       <w:r>
@@ -4519,7 +4733,6 @@
           <w:rFonts w:ascii="Roboto Mono" w:eastAsia="Roboto Mono" w:hAnsi="Roboto Mono" w:cs="Roboto Mono"/>
           <w:b/>
         </w:rPr>
-        <w:lastRenderedPageBreak/>
         <w:t>Test Deliverables</w:t>
       </w:r>
       <w:r>
@@ -4592,6 +4805,7 @@
         <w:rPr>
           <w:rFonts w:ascii="Roboto Mono" w:eastAsia="Roboto Mono" w:hAnsi="Roboto Mono" w:cs="Roboto Mono"/>
         </w:rPr>
+        <w:lastRenderedPageBreak/>
         <w:t>Entry: conditions that must be met before testing begins (e.g., code freeze, environment ready).</w:t>
       </w:r>
       <w:r>
@@ -4859,7 +5073,7 @@
     </w:p>
     <w:p>
       <w:r>
-        <w:pict w14:anchorId="527E9068">
+        <w:pict w14:anchorId="3F32A08D">
           <v:rect id="_x0000_i1046" style="width:0;height:1.5pt" o:hralign="center" o:hrstd="t" o:hr="t" fillcolor="#a0a0a0" stroked="f"/>
         </w:pict>
       </w:r>
@@ -4869,7 +5083,6 @@
         <w:pStyle w:val="Heading2"/>
         <w:keepNext w:val="0"/>
         <w:keepLines w:val="0"/>
-        <w:spacing w:after="80"/>
         <w:rPr>
           <w:b/>
           <w:sz w:val="34"/>
@@ -4884,7 +5097,6 @@
           <w:sz w:val="34"/>
           <w:szCs w:val="34"/>
         </w:rPr>
-        <w:lastRenderedPageBreak/>
         <w:t>📊 Benefits of Test Planning</w:t>
       </w:r>
     </w:p>
@@ -4905,21 +5117,12 @@
         </w:rPr>
         <w:t xml:space="preserve">: </w:t>
       </w:r>
-      <w:proofErr w:type="spellStart"/>
-      <w:r>
-        <w:rPr>
-          <w:b/>
-          <w:shd w:val="clear" w:color="auto" w:fill="B7B7B7"/>
-        </w:rPr>
-        <w:t>Chatgpt</w:t>
-      </w:r>
-      <w:proofErr w:type="spellEnd"/>
-      <w:r>
-        <w:rPr>
-          <w:b/>
-          <w:shd w:val="clear" w:color="auto" w:fill="B7B7B7"/>
-        </w:rPr>
-        <w:t xml:space="preserve"> </w:t>
+      <w:r>
+        <w:rPr>
+          <w:b/>
+          <w:shd w:val="clear" w:color="auto" w:fill="B7B7B7"/>
+        </w:rPr>
+        <w:t xml:space="preserve">Chatgpt </w:t>
       </w:r>
       <w:r>
         <w:rPr>
@@ -4928,7 +5131,26 @@
           <w:szCs w:val="14"/>
           <w:shd w:val="clear" w:color="auto" w:fill="B7B7B7"/>
         </w:rPr>
-        <w:t>(GPT-5-Standard) at [8/17/2025]</w:t>
+        <w:t>(GPT</w:t>
+      </w:r>
+      <w:r>
+        <w:rPr>
+          <w:rFonts w:ascii="Cambria Math" w:hAnsi="Cambria Math" w:cs="Cambria Math"/>
+          <w:b/>
+          <w:sz w:val="14"/>
+          <w:szCs w:val="14"/>
+          <w:shd w:val="clear" w:color="auto" w:fill="B7B7B7"/>
+        </w:rPr>
+        <w:t>‑</w:t>
+      </w:r>
+      <w:r>
+        <w:rPr>
+          <w:b/>
+          <w:sz w:val="14"/>
+          <w:szCs w:val="14"/>
+          <w:shd w:val="clear" w:color="auto" w:fill="B7B7B7"/>
+        </w:rPr>
+        <w:t>5 Mini) at [8/17/2025]</w:t>
       </w:r>
     </w:p>
     <w:p>
@@ -4976,6 +5198,7 @@
         <w:rPr>
           <w:rFonts w:ascii="Roboto Mono" w:eastAsia="Roboto Mono" w:hAnsi="Roboto Mono" w:cs="Roboto Mono"/>
         </w:rPr>
+        <w:lastRenderedPageBreak/>
         <w:t xml:space="preserve">Ensures </w:t>
       </w:r>
       <w:r>
@@ -5177,14 +5400,15 @@
     </w:p>
     <w:p>
       <w:r>
-        <w:pict w14:anchorId="3EADC7F8">
+        <w:pict w14:anchorId="14461239">
           <v:rect id="_x0000_i1047" style="width:0;height:1.5pt" o:hralign="center" o:hrstd="t" o:hr="t" fillcolor="#a0a0a0" stroked="f"/>
         </w:pict>
       </w:r>
     </w:p>
     <w:p/>
+    <w:p/>
     <w:sectPr>
-      <w:headerReference w:type="default" r:id="rId7"/>
+      <w:headerReference w:type="default" r:id="rId5"/>
       <w:pgSz w:w="12240" w:h="15840"/>
       <w:pgMar w:top="1440" w:right="1440" w:bottom="1440" w:left="1440" w:header="720" w:footer="720" w:gutter="0"/>
       <w:pgNumType w:start="1"/>
@@ -5192,56 +5416,6 @@
     </w:sectPr>
   </w:body>
 </w:document>
-</file>
-
-<file path=word/endnotes.xml><?xml version="1.0" encoding="utf-8"?>
-<w:endnotes xmlns:wpc="http://schemas.microsoft.com/office/word/2010/wordprocessingCanvas" xmlns:cx="http://schemas.microsoft.com/office/drawing/2014/chartex" xmlns:cx1="http://schemas.microsoft.com/office/drawing/2015/9/8/chartex" xmlns:cx2="http://schemas.microsoft.com/office/drawing/2015/10/21/chartex" xmlns:cx3="http://schemas.microsoft.com/office/drawing/2016/5/9/chartex" xmlns:cx4="http://schemas.microsoft.com/office/drawing/2016/5/10/chartex" xmlns:cx5="http://schemas.microsoft.com/office/drawing/2016/5/11/chartex" xmlns:cx6="http://schemas.microsoft.com/office/drawing/2016/5/12/chartex" xmlns:cx7="http://schemas.microsoft.com/office/drawing/2016/5/13/chartex" xmlns:cx8="http://schemas.microsoft.com/office/drawing/2016/5/14/chartex" xmlns:mc="http://schemas.openxmlformats.org/markup-compatibility/2006" xmlns:aink="http://schemas.microsoft.com/office/drawing/2016/ink" xmlns:am3d="http://schemas.microsoft.com/office/drawing/2017/model3d" xmlns:o="urn:schemas-microsoft-com:office:office" xmlns:oel="http://schemas.microsoft.com/office/2019/extlst" xmlns:r="http://schemas.openxmlformats.org/officeDocument/2006/relationships" xmlns:m="http://schemas.openxmlformats.org/officeDocument/2006/math" xmlns:v="urn:schemas-microsoft-com:vml" xmlns:wp14="http://schemas.microsoft.com/office/word/2010/wordprocessingDrawing" xmlns:wp="http://schemas.openxmlformats.org/drawingml/2006/wordprocessingDrawing" xmlns:w10="urn:schemas-microsoft-com:office:word" xmlns:w="http://schemas.openxmlformats.org/wordprocessingml/2006/main" xmlns:w14="http://schemas.microsoft.com/office/word/2010/wordml" xmlns:w15="http://schemas.microsoft.com/office/word/2012/wordml" xmlns:w16cex="http://schemas.microsoft.com/office/word/2018/wordml/cex" xmlns:w16cid="http://schemas.microsoft.com/office/word/2016/wordml/cid" xmlns:w16="http://schemas.microsoft.com/office/word/2018/wordml" xmlns:w16du="http://schemas.microsoft.com/office/word/2023/wordml/word16du" xmlns:w16sdtdh="http://schemas.microsoft.com/office/word/2020/wordml/sdtdatahash" xmlns:w16sdtfl="http://schemas.microsoft.com/office/word/2024/wordml/sdtformatlock" xmlns:w16se="http://schemas.microsoft.com/office/word/2015/wordml/symex" xmlns:wpg="http://schemas.microsoft.com/office/word/2010/wordprocessingGroup" xmlns:wpi="http://schemas.microsoft.com/office/word/2010/wordprocessingInk" xmlns:wne="http://schemas.microsoft.com/office/word/2006/wordml" xmlns:wps="http://schemas.microsoft.com/office/word/2010/wordprocessingShape" mc:Ignorable="w14 w15 w16se w16cid w16 w16cex w16sdtdh w16sdtfl w16du wp14">
-  <w:endnote w:type="separator" w:id="-1">
-    <w:p>
-      <w:pPr>
-        <w:spacing w:line="240" w:lineRule="auto"/>
-      </w:pPr>
-      <w:r>
-        <w:separator/>
-      </w:r>
-    </w:p>
-  </w:endnote>
-  <w:endnote w:type="continuationSeparator" w:id="0">
-    <w:p>
-      <w:pPr>
-        <w:spacing w:line="240" w:lineRule="auto"/>
-      </w:pPr>
-      <w:r>
-        <w:continuationSeparator/>
-      </w:r>
-    </w:p>
-  </w:endnote>
-</w:endnotes>
-</file>
-
-<file path=word/footnotes.xml><?xml version="1.0" encoding="utf-8"?>
-<w:footnotes xmlns:wpc="http://schemas.microsoft.com/office/word/2010/wordprocessingCanvas" xmlns:cx="http://schemas.microsoft.com/office/drawing/2014/chartex" xmlns:cx1="http://schemas.microsoft.com/office/drawing/2015/9/8/chartex" xmlns:cx2="http://schemas.microsoft.com/office/drawing/2015/10/21/chartex" xmlns:cx3="http://schemas.microsoft.com/office/drawing/2016/5/9/chartex" xmlns:cx4="http://schemas.microsoft.com/office/drawing/2016/5/10/chartex" xmlns:cx5="http://schemas.microsoft.com/office/drawing/2016/5/11/chartex" xmlns:cx6="http://schemas.microsoft.com/office/drawing/2016/5/12/chartex" xmlns:cx7="http://schemas.microsoft.com/office/drawing/2016/5/13/chartex" xmlns:cx8="http://schemas.microsoft.com/office/drawing/2016/5/14/chartex" xmlns:mc="http://schemas.openxmlformats.org/markup-compatibility/2006" xmlns:aink="http://schemas.microsoft.com/office/drawing/2016/ink" xmlns:am3d="http://schemas.microsoft.com/office/drawing/2017/model3d" xmlns:o="urn:schemas-microsoft-com:office:office" xmlns:oel="http://schemas.microsoft.com/office/2019/extlst" xmlns:r="http://schemas.openxmlformats.org/officeDocument/2006/relationships" xmlns:m="http://schemas.openxmlformats.org/officeDocument/2006/math" xmlns:v="urn:schemas-microsoft-com:vml" xmlns:wp14="http://schemas.microsoft.com/office/word/2010/wordprocessingDrawing" xmlns:wp="http://schemas.openxmlformats.org/drawingml/2006/wordprocessingDrawing" xmlns:w10="urn:schemas-microsoft-com:office:word" xmlns:w="http://schemas.openxmlformats.org/wordprocessingml/2006/main" xmlns:w14="http://schemas.microsoft.com/office/word/2010/wordml" xmlns:w15="http://schemas.microsoft.com/office/word/2012/wordml" xmlns:w16cex="http://schemas.microsoft.com/office/word/2018/wordml/cex" xmlns:w16cid="http://schemas.microsoft.com/office/word/2016/wordml/cid" xmlns:w16="http://schemas.microsoft.com/office/word/2018/wordml" xmlns:w16du="http://schemas.microsoft.com/office/word/2023/wordml/word16du" xmlns:w16sdtdh="http://schemas.microsoft.com/office/word/2020/wordml/sdtdatahash" xmlns:w16sdtfl="http://schemas.microsoft.com/office/word/2024/wordml/sdtformatlock" xmlns:w16se="http://schemas.microsoft.com/office/word/2015/wordml/symex" xmlns:wpg="http://schemas.microsoft.com/office/word/2010/wordprocessingGroup" xmlns:wpi="http://schemas.microsoft.com/office/word/2010/wordprocessingInk" xmlns:wne="http://schemas.microsoft.com/office/word/2006/wordml" xmlns:wps="http://schemas.microsoft.com/office/word/2010/wordprocessingShape" mc:Ignorable="w14 w15 w16se w16cid w16 w16cex w16sdtdh w16sdtfl w16du wp14">
-  <w:footnote w:type="separator" w:id="-1">
-    <w:p>
-      <w:pPr>
-        <w:spacing w:line="240" w:lineRule="auto"/>
-      </w:pPr>
-      <w:r>
-        <w:separator/>
-      </w:r>
-    </w:p>
-  </w:footnote>
-  <w:footnote w:type="continuationSeparator" w:id="0">
-    <w:p>
-      <w:pPr>
-        <w:spacing w:line="240" w:lineRule="auto"/>
-      </w:pPr>
-      <w:r>
-        <w:continuationSeparator/>
-      </w:r>
-    </w:p>
-  </w:footnote>
-</w:footnotes>
 </file>
 
 <file path=word/header1.xml><?xml version="1.0" encoding="utf-8"?>
@@ -7464,15 +7638,17 @@
   <w:docDefaults>
     <w:rPrDefault>
       <w:rPr>
-        <w:rFonts w:ascii="Arial" w:eastAsia="Arial" w:hAnsi="Arial" w:cs="Arial"/>
-        <w:sz w:val="22"/>
-        <w:szCs w:val="22"/>
-        <w:lang w:val="en" w:eastAsia="en-US" w:bidi="ar-SA"/>
+        <w:rFonts w:asciiTheme="minorHAnsi" w:eastAsiaTheme="minorHAnsi" w:hAnsiTheme="minorHAnsi" w:cstheme="minorBidi"/>
+        <w:kern w:val="2"/>
+        <w:sz w:val="24"/>
+        <w:szCs w:val="24"/>
+        <w:lang w:val="en-US" w:eastAsia="en-US" w:bidi="ar-SA"/>
+        <w14:ligatures w14:val="standardContextual"/>
       </w:rPr>
     </w:rPrDefault>
     <w:pPrDefault>
       <w:pPr>
-        <w:spacing w:line="276" w:lineRule="auto"/>
+        <w:spacing w:after="160" w:line="278" w:lineRule="auto"/>
       </w:pPr>
     </w:pPrDefault>
   </w:docDefaults>
@@ -7857,20 +8033,36 @@
   <w:style w:type="paragraph" w:default="1" w:styleId="Normal">
     <w:name w:val="Normal"/>
     <w:qFormat/>
+    <w:rsid w:val="007845CE"/>
+    <w:pPr>
+      <w:spacing w:after="0" w:line="276" w:lineRule="auto"/>
+    </w:pPr>
+    <w:rPr>
+      <w:rFonts w:ascii="Arial" w:eastAsia="Arial" w:hAnsi="Arial" w:cs="Arial"/>
+      <w:kern w:val="0"/>
+      <w:sz w:val="22"/>
+      <w:szCs w:val="22"/>
+      <w:lang w:val="en"/>
+      <w14:ligatures w14:val="none"/>
+    </w:rPr>
   </w:style>
   <w:style w:type="paragraph" w:styleId="Heading1">
     <w:name w:val="heading 1"/>
     <w:basedOn w:val="Normal"/>
     <w:next w:val="Normal"/>
+    <w:link w:val="Heading1Char"/>
     <w:uiPriority w:val="9"/>
     <w:qFormat/>
+    <w:rsid w:val="00EB7674"/>
     <w:pPr>
       <w:keepNext/>
       <w:keepLines/>
-      <w:spacing w:before="400" w:after="120"/>
+      <w:spacing w:before="360" w:after="80"/>
       <w:outlineLvl w:val="0"/>
     </w:pPr>
     <w:rPr>
+      <w:rFonts w:asciiTheme="majorHAnsi" w:eastAsiaTheme="majorEastAsia" w:hAnsiTheme="majorHAnsi" w:cstheme="majorBidi"/>
+      <w:color w:val="2F5496" w:themeColor="accent1" w:themeShade="BF"/>
       <w:sz w:val="40"/>
       <w:szCs w:val="40"/>
     </w:rPr>
@@ -7879,16 +8071,20 @@
     <w:name w:val="heading 2"/>
     <w:basedOn w:val="Normal"/>
     <w:next w:val="Normal"/>
+    <w:link w:val="Heading2Char"/>
     <w:uiPriority w:val="9"/>
     <w:unhideWhenUsed/>
     <w:qFormat/>
+    <w:rsid w:val="00EB7674"/>
     <w:pPr>
       <w:keepNext/>
       <w:keepLines/>
-      <w:spacing w:before="360" w:after="120"/>
+      <w:spacing w:before="160" w:after="80"/>
       <w:outlineLvl w:val="1"/>
     </w:pPr>
     <w:rPr>
+      <w:rFonts w:asciiTheme="majorHAnsi" w:eastAsiaTheme="majorEastAsia" w:hAnsiTheme="majorHAnsi" w:cstheme="majorBidi"/>
+      <w:color w:val="2F5496" w:themeColor="accent1" w:themeShade="BF"/>
       <w:sz w:val="32"/>
       <w:szCs w:val="32"/>
     </w:rPr>
@@ -7897,17 +8093,20 @@
     <w:name w:val="heading 3"/>
     <w:basedOn w:val="Normal"/>
     <w:next w:val="Normal"/>
+    <w:link w:val="Heading3Char"/>
     <w:uiPriority w:val="9"/>
     <w:unhideWhenUsed/>
     <w:qFormat/>
+    <w:rsid w:val="00EB7674"/>
     <w:pPr>
       <w:keepNext/>
       <w:keepLines/>
-      <w:spacing w:before="320" w:after="80"/>
+      <w:spacing w:before="160" w:after="80"/>
       <w:outlineLvl w:val="2"/>
     </w:pPr>
     <w:rPr>
-      <w:color w:val="434343"/>
+      <w:rFonts w:eastAsiaTheme="majorEastAsia" w:cstheme="majorBidi"/>
+      <w:color w:val="2F5496" w:themeColor="accent1" w:themeShade="BF"/>
       <w:sz w:val="28"/>
       <w:szCs w:val="28"/>
     </w:rPr>
@@ -7916,57 +8115,130 @@
     <w:name w:val="heading 4"/>
     <w:basedOn w:val="Normal"/>
     <w:next w:val="Normal"/>
+    <w:link w:val="Heading4Char"/>
     <w:uiPriority w:val="9"/>
     <w:semiHidden/>
     <w:unhideWhenUsed/>
     <w:qFormat/>
+    <w:rsid w:val="00EB7674"/>
     <w:pPr>
       <w:keepNext/>
       <w:keepLines/>
-      <w:spacing w:before="280" w:after="80"/>
+      <w:spacing w:before="80" w:after="40"/>
       <w:outlineLvl w:val="3"/>
     </w:pPr>
     <w:rPr>
-      <w:color w:val="666666"/>
-      <w:sz w:val="24"/>
-      <w:szCs w:val="24"/>
+      <w:rFonts w:eastAsiaTheme="majorEastAsia" w:cstheme="majorBidi"/>
+      <w:i/>
+      <w:iCs/>
+      <w:color w:val="2F5496" w:themeColor="accent1" w:themeShade="BF"/>
     </w:rPr>
   </w:style>
   <w:style w:type="paragraph" w:styleId="Heading5">
     <w:name w:val="heading 5"/>
     <w:basedOn w:val="Normal"/>
     <w:next w:val="Normal"/>
+    <w:link w:val="Heading5Char"/>
     <w:uiPriority w:val="9"/>
     <w:semiHidden/>
     <w:unhideWhenUsed/>
     <w:qFormat/>
+    <w:rsid w:val="00EB7674"/>
     <w:pPr>
       <w:keepNext/>
       <w:keepLines/>
-      <w:spacing w:before="240" w:after="80"/>
+      <w:spacing w:before="80" w:after="40"/>
       <w:outlineLvl w:val="4"/>
     </w:pPr>
     <w:rPr>
-      <w:color w:val="666666"/>
+      <w:rFonts w:eastAsiaTheme="majorEastAsia" w:cstheme="majorBidi"/>
+      <w:color w:val="2F5496" w:themeColor="accent1" w:themeShade="BF"/>
     </w:rPr>
   </w:style>
   <w:style w:type="paragraph" w:styleId="Heading6">
     <w:name w:val="heading 6"/>
     <w:basedOn w:val="Normal"/>
     <w:next w:val="Normal"/>
+    <w:link w:val="Heading6Char"/>
     <w:uiPriority w:val="9"/>
     <w:semiHidden/>
     <w:unhideWhenUsed/>
     <w:qFormat/>
+    <w:rsid w:val="00EB7674"/>
     <w:pPr>
       <w:keepNext/>
       <w:keepLines/>
-      <w:spacing w:before="240" w:after="80"/>
+      <w:spacing w:before="40"/>
       <w:outlineLvl w:val="5"/>
     </w:pPr>
     <w:rPr>
+      <w:rFonts w:eastAsiaTheme="majorEastAsia" w:cstheme="majorBidi"/>
       <w:i/>
-      <w:color w:val="666666"/>
+      <w:iCs/>
+      <w:color w:val="595959" w:themeColor="text1" w:themeTint="A6"/>
+    </w:rPr>
+  </w:style>
+  <w:style w:type="paragraph" w:styleId="Heading7">
+    <w:name w:val="heading 7"/>
+    <w:basedOn w:val="Normal"/>
+    <w:next w:val="Normal"/>
+    <w:link w:val="Heading7Char"/>
+    <w:uiPriority w:val="9"/>
+    <w:semiHidden/>
+    <w:unhideWhenUsed/>
+    <w:qFormat/>
+    <w:rsid w:val="00EB7674"/>
+    <w:pPr>
+      <w:keepNext/>
+      <w:keepLines/>
+      <w:spacing w:before="40"/>
+      <w:outlineLvl w:val="6"/>
+    </w:pPr>
+    <w:rPr>
+      <w:rFonts w:eastAsiaTheme="majorEastAsia" w:cstheme="majorBidi"/>
+      <w:color w:val="595959" w:themeColor="text1" w:themeTint="A6"/>
+    </w:rPr>
+  </w:style>
+  <w:style w:type="paragraph" w:styleId="Heading8">
+    <w:name w:val="heading 8"/>
+    <w:basedOn w:val="Normal"/>
+    <w:next w:val="Normal"/>
+    <w:link w:val="Heading8Char"/>
+    <w:uiPriority w:val="9"/>
+    <w:semiHidden/>
+    <w:unhideWhenUsed/>
+    <w:qFormat/>
+    <w:rsid w:val="00EB7674"/>
+    <w:pPr>
+      <w:keepNext/>
+      <w:keepLines/>
+      <w:outlineLvl w:val="7"/>
+    </w:pPr>
+    <w:rPr>
+      <w:rFonts w:eastAsiaTheme="majorEastAsia" w:cstheme="majorBidi"/>
+      <w:i/>
+      <w:iCs/>
+      <w:color w:val="272727" w:themeColor="text1" w:themeTint="D8"/>
+    </w:rPr>
+  </w:style>
+  <w:style w:type="paragraph" w:styleId="Heading9">
+    <w:name w:val="heading 9"/>
+    <w:basedOn w:val="Normal"/>
+    <w:next w:val="Normal"/>
+    <w:link w:val="Heading9Char"/>
+    <w:uiPriority w:val="9"/>
+    <w:semiHidden/>
+    <w:unhideWhenUsed/>
+    <w:qFormat/>
+    <w:rsid w:val="00EB7674"/>
+    <w:pPr>
+      <w:keepNext/>
+      <w:keepLines/>
+      <w:outlineLvl w:val="8"/>
+    </w:pPr>
+    <w:rPr>
+      <w:rFonts w:eastAsiaTheme="majorEastAsia" w:cstheme="majorBidi"/>
+      <w:color w:val="272727" w:themeColor="text1" w:themeTint="D8"/>
     </w:rPr>
   </w:style>
   <w:style w:type="character" w:default="1" w:styleId="DefaultParagraphFont">
@@ -7996,48 +8268,292 @@
     <w:semiHidden/>
     <w:unhideWhenUsed/>
   </w:style>
-  <w:style w:type="table" w:customStyle="1" w:styleId="TableNormal0">
-    <w:name w:val="TableNormal"/>
-    <w:tblPr>
-      <w:tblCellMar>
-        <w:top w:w="0" w:type="dxa"/>
-        <w:left w:w="0" w:type="dxa"/>
-        <w:bottom w:w="0" w:type="dxa"/>
-        <w:right w:w="0" w:type="dxa"/>
-      </w:tblCellMar>
-    </w:tblPr>
+  <w:style w:type="character" w:customStyle="1" w:styleId="Heading1Char">
+    <w:name w:val="Heading 1 Char"/>
+    <w:basedOn w:val="DefaultParagraphFont"/>
+    <w:link w:val="Heading1"/>
+    <w:uiPriority w:val="9"/>
+    <w:rsid w:val="00EB7674"/>
+    <w:rPr>
+      <w:rFonts w:asciiTheme="majorHAnsi" w:eastAsiaTheme="majorEastAsia" w:hAnsiTheme="majorHAnsi" w:cstheme="majorBidi"/>
+      <w:color w:val="2F5496" w:themeColor="accent1" w:themeShade="BF"/>
+      <w:sz w:val="40"/>
+      <w:szCs w:val="40"/>
+    </w:rPr>
+  </w:style>
+  <w:style w:type="character" w:customStyle="1" w:styleId="Heading2Char">
+    <w:name w:val="Heading 2 Char"/>
+    <w:basedOn w:val="DefaultParagraphFont"/>
+    <w:link w:val="Heading2"/>
+    <w:uiPriority w:val="9"/>
+    <w:rsid w:val="00EB7674"/>
+    <w:rPr>
+      <w:rFonts w:asciiTheme="majorHAnsi" w:eastAsiaTheme="majorEastAsia" w:hAnsiTheme="majorHAnsi" w:cstheme="majorBidi"/>
+      <w:color w:val="2F5496" w:themeColor="accent1" w:themeShade="BF"/>
+      <w:sz w:val="32"/>
+      <w:szCs w:val="32"/>
+    </w:rPr>
+  </w:style>
+  <w:style w:type="character" w:customStyle="1" w:styleId="Heading3Char">
+    <w:name w:val="Heading 3 Char"/>
+    <w:basedOn w:val="DefaultParagraphFont"/>
+    <w:link w:val="Heading3"/>
+    <w:uiPriority w:val="9"/>
+    <w:rsid w:val="00EB7674"/>
+    <w:rPr>
+      <w:rFonts w:eastAsiaTheme="majorEastAsia" w:cstheme="majorBidi"/>
+      <w:color w:val="2F5496" w:themeColor="accent1" w:themeShade="BF"/>
+      <w:sz w:val="28"/>
+      <w:szCs w:val="28"/>
+    </w:rPr>
+  </w:style>
+  <w:style w:type="character" w:customStyle="1" w:styleId="Heading4Char">
+    <w:name w:val="Heading 4 Char"/>
+    <w:basedOn w:val="DefaultParagraphFont"/>
+    <w:link w:val="Heading4"/>
+    <w:uiPriority w:val="9"/>
+    <w:semiHidden/>
+    <w:rsid w:val="00EB7674"/>
+    <w:rPr>
+      <w:rFonts w:eastAsiaTheme="majorEastAsia" w:cstheme="majorBidi"/>
+      <w:i/>
+      <w:iCs/>
+      <w:color w:val="2F5496" w:themeColor="accent1" w:themeShade="BF"/>
+    </w:rPr>
+  </w:style>
+  <w:style w:type="character" w:customStyle="1" w:styleId="Heading5Char">
+    <w:name w:val="Heading 5 Char"/>
+    <w:basedOn w:val="DefaultParagraphFont"/>
+    <w:link w:val="Heading5"/>
+    <w:uiPriority w:val="9"/>
+    <w:semiHidden/>
+    <w:rsid w:val="00EB7674"/>
+    <w:rPr>
+      <w:rFonts w:eastAsiaTheme="majorEastAsia" w:cstheme="majorBidi"/>
+      <w:color w:val="2F5496" w:themeColor="accent1" w:themeShade="BF"/>
+    </w:rPr>
+  </w:style>
+  <w:style w:type="character" w:customStyle="1" w:styleId="Heading6Char">
+    <w:name w:val="Heading 6 Char"/>
+    <w:basedOn w:val="DefaultParagraphFont"/>
+    <w:link w:val="Heading6"/>
+    <w:uiPriority w:val="9"/>
+    <w:semiHidden/>
+    <w:rsid w:val="00EB7674"/>
+    <w:rPr>
+      <w:rFonts w:eastAsiaTheme="majorEastAsia" w:cstheme="majorBidi"/>
+      <w:i/>
+      <w:iCs/>
+      <w:color w:val="595959" w:themeColor="text1" w:themeTint="A6"/>
+    </w:rPr>
+  </w:style>
+  <w:style w:type="character" w:customStyle="1" w:styleId="Heading7Char">
+    <w:name w:val="Heading 7 Char"/>
+    <w:basedOn w:val="DefaultParagraphFont"/>
+    <w:link w:val="Heading7"/>
+    <w:uiPriority w:val="9"/>
+    <w:semiHidden/>
+    <w:rsid w:val="00EB7674"/>
+    <w:rPr>
+      <w:rFonts w:eastAsiaTheme="majorEastAsia" w:cstheme="majorBidi"/>
+      <w:color w:val="595959" w:themeColor="text1" w:themeTint="A6"/>
+    </w:rPr>
+  </w:style>
+  <w:style w:type="character" w:customStyle="1" w:styleId="Heading8Char">
+    <w:name w:val="Heading 8 Char"/>
+    <w:basedOn w:val="DefaultParagraphFont"/>
+    <w:link w:val="Heading8"/>
+    <w:uiPriority w:val="9"/>
+    <w:semiHidden/>
+    <w:rsid w:val="00EB7674"/>
+    <w:rPr>
+      <w:rFonts w:eastAsiaTheme="majorEastAsia" w:cstheme="majorBidi"/>
+      <w:i/>
+      <w:iCs/>
+      <w:color w:val="272727" w:themeColor="text1" w:themeTint="D8"/>
+    </w:rPr>
+  </w:style>
+  <w:style w:type="character" w:customStyle="1" w:styleId="Heading9Char">
+    <w:name w:val="Heading 9 Char"/>
+    <w:basedOn w:val="DefaultParagraphFont"/>
+    <w:link w:val="Heading9"/>
+    <w:uiPriority w:val="9"/>
+    <w:semiHidden/>
+    <w:rsid w:val="00EB7674"/>
+    <w:rPr>
+      <w:rFonts w:eastAsiaTheme="majorEastAsia" w:cstheme="majorBidi"/>
+      <w:color w:val="272727" w:themeColor="text1" w:themeTint="D8"/>
+    </w:rPr>
   </w:style>
   <w:style w:type="paragraph" w:styleId="Title">
     <w:name w:val="Title"/>
     <w:basedOn w:val="Normal"/>
     <w:next w:val="Normal"/>
+    <w:link w:val="TitleChar"/>
     <w:uiPriority w:val="10"/>
     <w:qFormat/>
+    <w:rsid w:val="00EB7674"/>
     <w:pPr>
-      <w:keepNext/>
-      <w:keepLines/>
-      <w:spacing w:after="60"/>
+      <w:spacing w:after="80" w:line="240" w:lineRule="auto"/>
+      <w:contextualSpacing/>
     </w:pPr>
     <w:rPr>
-      <w:sz w:val="52"/>
-      <w:szCs w:val="52"/>
+      <w:rFonts w:asciiTheme="majorHAnsi" w:eastAsiaTheme="majorEastAsia" w:hAnsiTheme="majorHAnsi" w:cstheme="majorBidi"/>
+      <w:spacing w:val="-10"/>
+      <w:kern w:val="28"/>
+      <w:sz w:val="56"/>
+      <w:szCs w:val="56"/>
+    </w:rPr>
+  </w:style>
+  <w:style w:type="character" w:customStyle="1" w:styleId="TitleChar">
+    <w:name w:val="Title Char"/>
+    <w:basedOn w:val="DefaultParagraphFont"/>
+    <w:link w:val="Title"/>
+    <w:uiPriority w:val="10"/>
+    <w:rsid w:val="00EB7674"/>
+    <w:rPr>
+      <w:rFonts w:asciiTheme="majorHAnsi" w:eastAsiaTheme="majorEastAsia" w:hAnsiTheme="majorHAnsi" w:cstheme="majorBidi"/>
+      <w:spacing w:val="-10"/>
+      <w:kern w:val="28"/>
+      <w:sz w:val="56"/>
+      <w:szCs w:val="56"/>
     </w:rPr>
   </w:style>
   <w:style w:type="paragraph" w:styleId="Subtitle">
     <w:name w:val="Subtitle"/>
     <w:basedOn w:val="Normal"/>
     <w:next w:val="Normal"/>
+    <w:link w:val="SubtitleChar"/>
     <w:uiPriority w:val="11"/>
     <w:qFormat/>
+    <w:rsid w:val="00EB7674"/>
     <w:pPr>
-      <w:keepNext/>
-      <w:keepLines/>
-      <w:spacing w:after="320"/>
+      <w:numPr>
+        <w:ilvl w:val="1"/>
+      </w:numPr>
     </w:pPr>
     <w:rPr>
-      <w:color w:val="666666"/>
-      <w:sz w:val="30"/>
-      <w:szCs w:val="30"/>
+      <w:rFonts w:eastAsiaTheme="majorEastAsia" w:cstheme="majorBidi"/>
+      <w:color w:val="595959" w:themeColor="text1" w:themeTint="A6"/>
+      <w:spacing w:val="15"/>
+      <w:sz w:val="28"/>
+      <w:szCs w:val="28"/>
+    </w:rPr>
+  </w:style>
+  <w:style w:type="character" w:customStyle="1" w:styleId="SubtitleChar">
+    <w:name w:val="Subtitle Char"/>
+    <w:basedOn w:val="DefaultParagraphFont"/>
+    <w:link w:val="Subtitle"/>
+    <w:uiPriority w:val="11"/>
+    <w:rsid w:val="00EB7674"/>
+    <w:rPr>
+      <w:rFonts w:eastAsiaTheme="majorEastAsia" w:cstheme="majorBidi"/>
+      <w:color w:val="595959" w:themeColor="text1" w:themeTint="A6"/>
+      <w:spacing w:val="15"/>
+      <w:sz w:val="28"/>
+      <w:szCs w:val="28"/>
+    </w:rPr>
+  </w:style>
+  <w:style w:type="paragraph" w:styleId="Quote">
+    <w:name w:val="Quote"/>
+    <w:basedOn w:val="Normal"/>
+    <w:next w:val="Normal"/>
+    <w:link w:val="QuoteChar"/>
+    <w:uiPriority w:val="29"/>
+    <w:qFormat/>
+    <w:rsid w:val="00EB7674"/>
+    <w:pPr>
+      <w:spacing w:before="160"/>
+      <w:jc w:val="center"/>
+    </w:pPr>
+    <w:rPr>
+      <w:i/>
+      <w:iCs/>
+      <w:color w:val="404040" w:themeColor="text1" w:themeTint="BF"/>
+    </w:rPr>
+  </w:style>
+  <w:style w:type="character" w:customStyle="1" w:styleId="QuoteChar">
+    <w:name w:val="Quote Char"/>
+    <w:basedOn w:val="DefaultParagraphFont"/>
+    <w:link w:val="Quote"/>
+    <w:uiPriority w:val="29"/>
+    <w:rsid w:val="00EB7674"/>
+    <w:rPr>
+      <w:i/>
+      <w:iCs/>
+      <w:color w:val="404040" w:themeColor="text1" w:themeTint="BF"/>
+    </w:rPr>
+  </w:style>
+  <w:style w:type="paragraph" w:styleId="ListParagraph">
+    <w:name w:val="List Paragraph"/>
+    <w:basedOn w:val="Normal"/>
+    <w:uiPriority w:val="34"/>
+    <w:qFormat/>
+    <w:rsid w:val="00EB7674"/>
+    <w:pPr>
+      <w:ind w:left="720"/>
+      <w:contextualSpacing/>
+    </w:pPr>
+  </w:style>
+  <w:style w:type="character" w:styleId="IntenseEmphasis">
+    <w:name w:val="Intense Emphasis"/>
+    <w:basedOn w:val="DefaultParagraphFont"/>
+    <w:uiPriority w:val="21"/>
+    <w:qFormat/>
+    <w:rsid w:val="00EB7674"/>
+    <w:rPr>
+      <w:i/>
+      <w:iCs/>
+      <w:color w:val="2F5496" w:themeColor="accent1" w:themeShade="BF"/>
+    </w:rPr>
+  </w:style>
+  <w:style w:type="paragraph" w:styleId="IntenseQuote">
+    <w:name w:val="Intense Quote"/>
+    <w:basedOn w:val="Normal"/>
+    <w:next w:val="Normal"/>
+    <w:link w:val="IntenseQuoteChar"/>
+    <w:uiPriority w:val="30"/>
+    <w:qFormat/>
+    <w:rsid w:val="00EB7674"/>
+    <w:pPr>
+      <w:pBdr>
+        <w:top w:val="single" w:sz="4" w:space="10" w:color="2F5496" w:themeColor="accent1" w:themeShade="BF"/>
+        <w:bottom w:val="single" w:sz="4" w:space="10" w:color="2F5496" w:themeColor="accent1" w:themeShade="BF"/>
+      </w:pBdr>
+      <w:spacing w:before="360" w:after="360"/>
+      <w:ind w:left="864" w:right="864"/>
+      <w:jc w:val="center"/>
+    </w:pPr>
+    <w:rPr>
+      <w:i/>
+      <w:iCs/>
+      <w:color w:val="2F5496" w:themeColor="accent1" w:themeShade="BF"/>
+    </w:rPr>
+  </w:style>
+  <w:style w:type="character" w:customStyle="1" w:styleId="IntenseQuoteChar">
+    <w:name w:val="Intense Quote Char"/>
+    <w:basedOn w:val="DefaultParagraphFont"/>
+    <w:link w:val="IntenseQuote"/>
+    <w:uiPriority w:val="30"/>
+    <w:rsid w:val="00EB7674"/>
+    <w:rPr>
+      <w:i/>
+      <w:iCs/>
+      <w:color w:val="2F5496" w:themeColor="accent1" w:themeShade="BF"/>
+    </w:rPr>
+  </w:style>
+  <w:style w:type="character" w:styleId="IntenseReference">
+    <w:name w:val="Intense Reference"/>
+    <w:basedOn w:val="DefaultParagraphFont"/>
+    <w:uiPriority w:val="32"/>
+    <w:qFormat/>
+    <w:rsid w:val="00EB7674"/>
+    <w:rPr>
+      <w:b/>
+      <w:bCs/>
+      <w:smallCaps/>
+      <w:color w:val="2F5496" w:themeColor="accent1" w:themeShade="BF"/>
+      <w:spacing w:val="5"/>
     </w:rPr>
   </w:style>
 </w:styles>
@@ -8054,44 +8570,44 @@
         <a:sysClr val="window" lastClr="FFFFFF"/>
       </a:lt1>
       <a:dk2>
-        <a:srgbClr val="1F497D"/>
+        <a:srgbClr val="44546A"/>
       </a:dk2>
       <a:lt2>
-        <a:srgbClr val="EEECE1"/>
+        <a:srgbClr val="E7E6E6"/>
       </a:lt2>
       <a:accent1>
-        <a:srgbClr val="4F81BD"/>
+        <a:srgbClr val="4472C4"/>
       </a:accent1>
       <a:accent2>
-        <a:srgbClr val="C0504D"/>
+        <a:srgbClr val="ED7D31"/>
       </a:accent2>
       <a:accent3>
-        <a:srgbClr val="9BBB59"/>
+        <a:srgbClr val="A5A5A5"/>
       </a:accent3>
       <a:accent4>
-        <a:srgbClr val="8064A2"/>
+        <a:srgbClr val="FFC000"/>
       </a:accent4>
       <a:accent5>
-        <a:srgbClr val="4BACC6"/>
+        <a:srgbClr val="5B9BD5"/>
       </a:accent5>
       <a:accent6>
-        <a:srgbClr val="F79646"/>
+        <a:srgbClr val="70AD47"/>
       </a:accent6>
       <a:hlink>
-        <a:srgbClr val="0000FF"/>
+        <a:srgbClr val="0563C1"/>
       </a:hlink>
       <a:folHlink>
-        <a:srgbClr val="800080"/>
+        <a:srgbClr val="954F72"/>
       </a:folHlink>
     </a:clrScheme>
     <a:fontScheme name="Office">
       <a:majorFont>
-        <a:latin typeface="Calibri"/>
+        <a:latin typeface="Calibri Light" panose="020F0302020204030204"/>
         <a:ea typeface=""/>
         <a:cs typeface=""/>
-        <a:font script="Jpan" typeface="ＭＳ ゴシック"/>
+        <a:font script="Jpan" typeface="游ゴシック Light"/>
         <a:font script="Hang" typeface="맑은 고딕"/>
-        <a:font script="Hans" typeface="宋体"/>
+        <a:font script="Hans" typeface="等线 Light"/>
         <a:font script="Hant" typeface="新細明體"/>
         <a:font script="Arab" typeface="Times New Roman"/>
         <a:font script="Hebr" typeface="Times New Roman"/>
@@ -8119,14 +8635,31 @@
         <a:font script="Viet" typeface="Times New Roman"/>
         <a:font script="Uigh" typeface="Microsoft Uighur"/>
         <a:font script="Geor" typeface="Sylfaen"/>
+        <a:font script="Armn" typeface="Arial"/>
+        <a:font script="Bugi" typeface="Leelawadee UI"/>
+        <a:font script="Bopo" typeface="Microsoft JhengHei"/>
+        <a:font script="Java" typeface="Javanese Text"/>
+        <a:font script="Lisu" typeface="Segoe UI"/>
+        <a:font script="Mymr" typeface="Myanmar Text"/>
+        <a:font script="Nkoo" typeface="Ebrima"/>
+        <a:font script="Olck" typeface="Nirmala UI"/>
+        <a:font script="Osma" typeface="Ebrima"/>
+        <a:font script="Phag" typeface="Phagspa"/>
+        <a:font script="Syrn" typeface="Estrangelo Edessa"/>
+        <a:font script="Syrj" typeface="Estrangelo Edessa"/>
+        <a:font script="Syre" typeface="Estrangelo Edessa"/>
+        <a:font script="Sora" typeface="Nirmala UI"/>
+        <a:font script="Tale" typeface="Microsoft Tai Le"/>
+        <a:font script="Talu" typeface="Microsoft New Tai Lue"/>
+        <a:font script="Tfng" typeface="Ebrima"/>
       </a:majorFont>
       <a:minorFont>
-        <a:latin typeface="Cambria"/>
+        <a:latin typeface="Calibri" panose="020F0502020204030204"/>
         <a:ea typeface=""/>
         <a:cs typeface=""/>
-        <a:font script="Jpan" typeface="ＭＳ 明朝"/>
+        <a:font script="Jpan" typeface="游ゴシック"/>
         <a:font script="Hang" typeface="맑은 고딕"/>
-        <a:font script="Hans" typeface="宋体"/>
+        <a:font script="Hans" typeface="等线"/>
         <a:font script="Hant" typeface="新細明體"/>
         <a:font script="Arab" typeface="Arial"/>
         <a:font script="Hebr" typeface="Arial"/>
@@ -8154,6 +8687,23 @@
         <a:font script="Viet" typeface="Arial"/>
         <a:font script="Uigh" typeface="Microsoft Uighur"/>
         <a:font script="Geor" typeface="Sylfaen"/>
+        <a:font script="Armn" typeface="Arial"/>
+        <a:font script="Bugi" typeface="Leelawadee UI"/>
+        <a:font script="Bopo" typeface="Microsoft JhengHei"/>
+        <a:font script="Java" typeface="Javanese Text"/>
+        <a:font script="Lisu" typeface="Segoe UI"/>
+        <a:font script="Mymr" typeface="Myanmar Text"/>
+        <a:font script="Nkoo" typeface="Ebrima"/>
+        <a:font script="Olck" typeface="Nirmala UI"/>
+        <a:font script="Osma" typeface="Ebrima"/>
+        <a:font script="Phag" typeface="Phagspa"/>
+        <a:font script="Syrn" typeface="Estrangelo Edessa"/>
+        <a:font script="Syrj" typeface="Estrangelo Edessa"/>
+        <a:font script="Syre" typeface="Estrangelo Edessa"/>
+        <a:font script="Sora" typeface="Nirmala UI"/>
+        <a:font script="Tale" typeface="Microsoft Tai Le"/>
+        <a:font script="Talu" typeface="Microsoft New Tai Lue"/>
+        <a:font script="Tfng" typeface="Ebrima"/>
       </a:minorFont>
     </a:fontScheme>
     <a:fmtScheme name="Office">
@@ -8165,200 +8715,141 @@
           <a:gsLst>
             <a:gs pos="0">
               <a:schemeClr val="phClr">
-                <a:tint val="50000"/>
-                <a:satMod val="300000"/>
+                <a:lumMod val="110000"/>
+                <a:satMod val="105000"/>
+                <a:tint val="67000"/>
               </a:schemeClr>
             </a:gs>
-            <a:gs pos="35000">
+            <a:gs pos="50000">
               <a:schemeClr val="phClr">
-                <a:tint val="37000"/>
-                <a:satMod val="300000"/>
+                <a:lumMod val="105000"/>
+                <a:satMod val="103000"/>
+                <a:tint val="73000"/>
               </a:schemeClr>
             </a:gs>
             <a:gs pos="100000">
               <a:schemeClr val="phClr">
-                <a:tint val="15000"/>
-                <a:satMod val="350000"/>
+                <a:lumMod val="105000"/>
+                <a:satMod val="109000"/>
+                <a:tint val="81000"/>
               </a:schemeClr>
             </a:gs>
           </a:gsLst>
-          <a:lin ang="16200000" scaled="1"/>
+          <a:lin ang="5400000" scaled="0"/>
         </a:gradFill>
         <a:gradFill rotWithShape="1">
           <a:gsLst>
             <a:gs pos="0">
               <a:schemeClr val="phClr">
-                <a:tint val="100000"/>
+                <a:satMod val="103000"/>
+                <a:lumMod val="102000"/>
+                <a:tint val="94000"/>
+              </a:schemeClr>
+            </a:gs>
+            <a:gs pos="50000">
+              <a:schemeClr val="phClr">
+                <a:satMod val="110000"/>
+                <a:lumMod val="100000"/>
                 <a:shade val="100000"/>
-                <a:satMod val="130000"/>
               </a:schemeClr>
             </a:gs>
             <a:gs pos="100000">
               <a:schemeClr val="phClr">
-                <a:tint val="50000"/>
-                <a:shade val="100000"/>
-                <a:satMod val="350000"/>
+                <a:lumMod val="99000"/>
+                <a:satMod val="120000"/>
+                <a:shade val="78000"/>
               </a:schemeClr>
             </a:gs>
           </a:gsLst>
-          <a:lin ang="16200000" scaled="0"/>
+          <a:lin ang="5400000" scaled="0"/>
         </a:gradFill>
       </a:fillStyleLst>
       <a:lnStyleLst>
-        <a:ln w="9525" cap="flat" cmpd="sng" algn="ctr">
-          <a:solidFill>
-            <a:schemeClr val="phClr">
-              <a:shade val="95000"/>
-              <a:satMod val="105000"/>
-            </a:schemeClr>
-          </a:solidFill>
-          <a:prstDash val="solid"/>
-        </a:ln>
-        <a:ln w="25400" cap="flat" cmpd="sng" algn="ctr">
+        <a:ln w="6350" cap="flat" cmpd="sng" algn="ctr">
           <a:solidFill>
             <a:schemeClr val="phClr"/>
           </a:solidFill>
           <a:prstDash val="solid"/>
+          <a:miter lim="800000"/>
         </a:ln>
-        <a:ln w="38100" cap="flat" cmpd="sng" algn="ctr">
+        <a:ln w="12700" cap="flat" cmpd="sng" algn="ctr">
           <a:solidFill>
             <a:schemeClr val="phClr"/>
           </a:solidFill>
           <a:prstDash val="solid"/>
+          <a:miter lim="800000"/>
+        </a:ln>
+        <a:ln w="19050" cap="flat" cmpd="sng" algn="ctr">
+          <a:solidFill>
+            <a:schemeClr val="phClr"/>
+          </a:solidFill>
+          <a:prstDash val="solid"/>
+          <a:miter lim="800000"/>
         </a:ln>
       </a:lnStyleLst>
       <a:effectStyleLst>
         <a:effectStyle>
+          <a:effectLst/>
+        </a:effectStyle>
+        <a:effectStyle>
+          <a:effectLst/>
+        </a:effectStyle>
+        <a:effectStyle>
           <a:effectLst>
-            <a:outerShdw blurRad="40000" dist="20000" dir="5400000" rotWithShape="0">
+            <a:outerShdw blurRad="57150" dist="19050" dir="5400000" algn="ctr" rotWithShape="0">
               <a:srgbClr val="000000">
-                <a:alpha val="38000"/>
+                <a:alpha val="63000"/>
               </a:srgbClr>
             </a:outerShdw>
           </a:effectLst>
-        </a:effectStyle>
-        <a:effectStyle>
-          <a:effectLst>
-            <a:outerShdw blurRad="40000" dist="23000" dir="5400000" rotWithShape="0">
-              <a:srgbClr val="000000">
-                <a:alpha val="35000"/>
-              </a:srgbClr>
-            </a:outerShdw>
-          </a:effectLst>
-        </a:effectStyle>
-        <a:effectStyle>
-          <a:effectLst>
-            <a:outerShdw blurRad="40000" dist="23000" dir="5400000" rotWithShape="0">
-              <a:srgbClr val="000000">
-                <a:alpha val="35000"/>
-              </a:srgbClr>
-            </a:outerShdw>
-          </a:effectLst>
-          <a:scene3d>
-            <a:camera prst="orthographicFront">
-              <a:rot lat="0" lon="0" rev="0"/>
-            </a:camera>
-            <a:lightRig rig="threePt" dir="t">
-              <a:rot lat="0" lon="0" rev="1200000"/>
-            </a:lightRig>
-          </a:scene3d>
-          <a:sp3d>
-            <a:bevelT w="63500" h="25400"/>
-          </a:sp3d>
         </a:effectStyle>
       </a:effectStyleLst>
       <a:bgFillStyleLst>
         <a:solidFill>
           <a:schemeClr val="phClr"/>
         </a:solidFill>
+        <a:solidFill>
+          <a:schemeClr val="phClr">
+            <a:tint val="95000"/>
+            <a:satMod val="170000"/>
+          </a:schemeClr>
+        </a:solidFill>
         <a:gradFill rotWithShape="1">
           <a:gsLst>
             <a:gs pos="0">
               <a:schemeClr val="phClr">
-                <a:tint val="40000"/>
-                <a:satMod val="350000"/>
+                <a:tint val="93000"/>
+                <a:satMod val="150000"/>
+                <a:shade val="98000"/>
+                <a:lumMod val="102000"/>
               </a:schemeClr>
             </a:gs>
-            <a:gs pos="40000">
+            <a:gs pos="50000">
               <a:schemeClr val="phClr">
-                <a:tint val="45000"/>
-                <a:shade val="99000"/>
-                <a:satMod val="350000"/>
+                <a:tint val="98000"/>
+                <a:satMod val="130000"/>
+                <a:shade val="90000"/>
+                <a:lumMod val="103000"/>
               </a:schemeClr>
             </a:gs>
             <a:gs pos="100000">
               <a:schemeClr val="phClr">
-                <a:shade val="20000"/>
-                <a:satMod val="255000"/>
+                <a:shade val="63000"/>
+                <a:satMod val="120000"/>
               </a:schemeClr>
             </a:gs>
           </a:gsLst>
-          <a:path path="circle">
-            <a:fillToRect l="50000" t="-80000" r="50000" b="180000"/>
-          </a:path>
-        </a:gradFill>
-        <a:gradFill rotWithShape="1">
-          <a:gsLst>
-            <a:gs pos="0">
-              <a:schemeClr val="phClr">
-                <a:tint val="80000"/>
-                <a:satMod val="300000"/>
-              </a:schemeClr>
-            </a:gs>
-            <a:gs pos="100000">
-              <a:schemeClr val="phClr">
-                <a:shade val="30000"/>
-                <a:satMod val="200000"/>
-              </a:schemeClr>
-            </a:gs>
-          </a:gsLst>
-          <a:path path="circle">
-            <a:fillToRect l="50000" t="50000" r="50000" b="50000"/>
-          </a:path>
+          <a:lin ang="5400000" scaled="0"/>
         </a:gradFill>
       </a:bgFillStyleLst>
     </a:fmtScheme>
   </a:themeElements>
-  <a:objectDefaults>
-    <a:spDef>
-      <a:spPr/>
-      <a:bodyPr/>
-      <a:lstStyle/>
-      <a:style>
-        <a:lnRef idx="1">
-          <a:schemeClr val="accent1"/>
-        </a:lnRef>
-        <a:fillRef idx="3">
-          <a:schemeClr val="accent1"/>
-        </a:fillRef>
-        <a:effectRef idx="2">
-          <a:schemeClr val="accent1"/>
-        </a:effectRef>
-        <a:fontRef idx="minor">
-          <a:schemeClr val="lt1"/>
-        </a:fontRef>
-      </a:style>
-    </a:spDef>
-    <a:lnDef>
-      <a:spPr/>
-      <a:bodyPr/>
-      <a:lstStyle/>
-      <a:style>
-        <a:lnRef idx="2">
-          <a:schemeClr val="accent1"/>
-        </a:lnRef>
-        <a:fillRef idx="0">
-          <a:schemeClr val="accent1"/>
-        </a:fillRef>
-        <a:effectRef idx="1">
-          <a:schemeClr val="accent1"/>
-        </a:effectRef>
-        <a:fontRef idx="minor">
-          <a:schemeClr val="tx1"/>
-        </a:fontRef>
-      </a:style>
-    </a:lnDef>
-  </a:objectDefaults>
+  <a:objectDefaults/>
   <a:extraClrSchemeLst/>
+  <a:extLst>
+    <a:ext uri="{05A4C25C-085E-4340-85A3-A5531E510DB2}">
+      <thm15:themeFamily xmlns:thm15="http://schemas.microsoft.com/office/thememl/2012/main" name="Office Theme" id="{62F939B6-93AF-4DB8-9C6B-D6C7DFDC589F}" vid="{4A3C46E8-61CC-4603-A589-7422A47A8E4A}"/>
+    </a:ext>
+  </a:extLst>
 </a:theme>
 </file>
</xml_diff>